<commit_message>
Level 1 Lesson 1: new audio length (about 1:14) and credit for Ana's voice
Listening-script heading now says about 1:14. Picture Credits add: Ana's voice is based on LibriTTS-R
speaker 1580 (Koizumi et al. 2023, CC BY 4.0), from LibriVox public-domain readings. Rebuilt the
lesson PDF/DOCX and the Level 1 site data (new MP3 size).
</commit_message>
<xml_diff>
--- a/public/level1/downloads/Level1_Lesson1.docx
+++ b/public/level1/downloads/Level1_Lesson1.docx
@@ -7318,7 +7318,7 @@
           <w:color w:val="1B6F7A"/>
           <w:sz w:val="30"/>
         </w:rPr>
-        <w:t xml:space="preserve"> (about 1:17; the conversation plays once, so play the audio again if needed)</w:t>
+        <w:t xml:space="preserve"> (about 1:14; the conversation plays once, so play the audio again if needed)</w:t>
       </w:r>
     </w:p>
     <w:tbl>
@@ -23304,7 +23304,7 @@
           <w:i w:val="0"/>
           <w:sz w:val="22"/>
         </w:rPr>
-        <w:t>Task icons on the pages are standard emoji characters shown with the computer's emoji font. Listening audio: synthetic voices made with Chatterbox TTS (Resemble AI, MIT License); each file carries an inaudible Perth watermark marking it as AI-generated. Course materials: © 2026 the authors, CC BY-NC-SA 4.0.</w:t>
+        <w:t>Task icons on the pages are standard emoji characters shown with the computer's emoji font. Listening audio: synthetic voices made with Chatterbox TTS (Resemble AI, MIT License); each file carries an inaudible Perth watermark marking it as AI-generated. Ana's voice is based on LibriTTS-R speaker 1580 (Koizumi et al. 2023, CC BY 4.0, https://creativecommons.org/licenses/by/4.0/), from LibriVox public-domain readings. Course materials: © 2026 the authors, CC BY-NC-SA 4.0.</w:t>
       </w:r>
     </w:p>
     <w:sectPr>

</xml_diff>

<commit_message>
Level 1 Lesson 1: remove the task instruction icons from the pages
Remove the icon key page, the icons in How Our Class Works, the icon column
on Classroom Phrases, and the icons in front of every task instruction. Keep
the Spanish and "My language" lines, the vocabulary pictures and the star
marker. The plain text now says what an icon said ("With a partner: ...").
Teacher notes no longer mention the icons. The scope and sequence now says
there are no icons. PDF/DOCX rebuilt; site content re-exported.
</commit_message>
<xml_diff>
--- a/public/level1/downloads/Level1_Lesson1.docx
+++ b/public/level1/downloads/Level1_Lesson1.docx
@@ -446,7 +446,7 @@
                 <w:i w:val="0"/>
                 <w:sz w:val="19"/>
               </w:rPr>
-              <w:t xml:space="preserve">Icon key (first page), How Our Class Works, New Words, Classroom Phrases, Listening, Grammar, Talk Time sign-in sheet, Homework, Letters &amp; Numbers, Progress Check. </w:t>
+              <w:t xml:space="preserve">How Our Class Works, New Words, Classroom Phrases, Listening, Grammar, Talk Time sign-in sheet, Homework, Letters &amp; Numbers, Progress Check. </w:t>
             </w:r>
             <w:r>
               <w:rPr>
@@ -1327,7 +1327,7 @@
                 <w:i w:val="0"/>
                 <w:sz w:val="22"/>
               </w:rPr>
-              <w:t xml:space="preserve"> Teach in English. Show, point, and gesture. The student pages have a picture icon, a Spanish line, and a "My language" line for every task. Learners read those on their own. You never need to read, translate, or explain them.</w:t>
+              <w:t xml:space="preserve"> Teach in English. Show, point, and gesture. The student pages have a Spanish line and a "My language" line for every task. Learners read those on their own. You never need to read, translate, or explain them.</w:t>
             </w:r>
           </w:p>
         </w:tc>
@@ -1381,7 +1381,7 @@
                 <w:i w:val="0"/>
                 <w:sz w:val="22"/>
               </w:rPr>
-              <w:t>The icons:</w:t>
+              <w:t>Instruction rule:</w:t>
             </w:r>
             <w:r>
               <w:rPr>
@@ -1389,7 +1389,7 @@
                 <w:i w:val="0"/>
                 <w:sz w:val="22"/>
               </w:rPr>
-              <w:t xml:space="preserve"> every task on the student pages starts with the same icons: 👂 listen · 🗣️ say · 📖 read · ✏️ write · ⭕ circle · ✅ check · ☝️ point · 🔗 match · 👥 partner · 👨‍👩‍👧 group · 🚶 walk and talk · 🏠 homework. </w:t>
+              <w:t xml:space="preserve"> </w:t>
             </w:r>
             <w:r>
               <w:rPr>
@@ -1397,7 +1397,7 @@
                 <w:i w:val="0"/>
                 <w:sz w:val="22"/>
               </w:rPr>
-              <w:t>Point to the icon when you give an instruction.</w:t>
+              <w:t>Model it</w:t>
             </w:r>
             <w:r>
               <w:rPr>
@@ -1405,7 +1405,47 @@
                 <w:i w:val="0"/>
                 <w:sz w:val="22"/>
               </w:rPr>
-              <w:t xml:space="preserve"> After a few weeks, learners know what to do from the icon alone.</w:t>
+              <w:t xml:space="preserve"> (do it with one learner while everyone watches), </w:t>
+            </w:r>
+            <w:r>
+              <w:rPr>
+                <w:b/>
+                <w:i w:val="0"/>
+                <w:sz w:val="22"/>
+              </w:rPr>
+              <w:t>check it</w:t>
+            </w:r>
+            <w:r>
+              <w:rPr>
+                <w:b w:val="0"/>
+                <w:i w:val="0"/>
+                <w:sz w:val="22"/>
+              </w:rPr>
+              <w:t xml:space="preserve"> (ask: "Listen or write?"), </w:t>
+            </w:r>
+            <w:r>
+              <w:rPr>
+                <w:b/>
+                <w:i w:val="0"/>
+                <w:sz w:val="22"/>
+              </w:rPr>
+              <w:t>then go</w:t>
+            </w:r>
+            <w:r>
+              <w:rPr>
+                <w:b w:val="0"/>
+                <w:i w:val="0"/>
+                <w:sz w:val="22"/>
+              </w:rPr>
+              <w:t xml:space="preserve">. Say less, show more. Use the same short words every time: </w:t>
+            </w:r>
+            <w:r>
+              <w:rPr>
+                <w:b w:val="0"/>
+                <w:i/>
+                <w:sz w:val="22"/>
+              </w:rPr>
+              <w:t>Listen. Repeat. Point. Circle. Write. Partner. Group.</w:t>
             </w:r>
           </w:p>
         </w:tc>
@@ -1459,7 +1499,7 @@
                 <w:i w:val="0"/>
                 <w:sz w:val="22"/>
               </w:rPr>
-              <w:t>Instruction rule:</w:t>
+              <w:t>Grouping toolkit:</w:t>
             </w:r>
             <w:r>
               <w:rPr>
@@ -1468,54 +1508,6 @@
                 <w:sz w:val="22"/>
               </w:rPr>
               <w:t xml:space="preserve"> </w:t>
-            </w:r>
-            <w:r>
-              <w:rPr>
-                <w:b/>
-                <w:i w:val="0"/>
-                <w:sz w:val="22"/>
-              </w:rPr>
-              <w:t>Model it</w:t>
-            </w:r>
-            <w:r>
-              <w:rPr>
-                <w:b w:val="0"/>
-                <w:i w:val="0"/>
-                <w:sz w:val="22"/>
-              </w:rPr>
-              <w:t xml:space="preserve"> (do it with one learner while everyone watches), </w:t>
-            </w:r>
-            <w:r>
-              <w:rPr>
-                <w:b/>
-                <w:i w:val="0"/>
-                <w:sz w:val="22"/>
-              </w:rPr>
-              <w:t>check it</w:t>
-            </w:r>
-            <w:r>
-              <w:rPr>
-                <w:b w:val="0"/>
-                <w:i w:val="0"/>
-                <w:sz w:val="22"/>
-              </w:rPr>
-              <w:t xml:space="preserve"> (point to the icon: "Listen or write?"), </w:t>
-            </w:r>
-            <w:r>
-              <w:rPr>
-                <w:b/>
-                <w:i w:val="0"/>
-                <w:sz w:val="22"/>
-              </w:rPr>
-              <w:t>then go</w:t>
-            </w:r>
-            <w:r>
-              <w:rPr>
-                <w:b w:val="0"/>
-                <w:i w:val="0"/>
-                <w:sz w:val="22"/>
-              </w:rPr>
-              <w:t xml:space="preserve">. Say less, show more. Use the same short words every time: </w:t>
             </w:r>
             <w:r>
               <w:rPr>
@@ -1523,7 +1515,47 @@
                 <w:i/>
                 <w:sz w:val="22"/>
               </w:rPr>
-              <w:t>Listen. Repeat. Point. Circle. Write. Partner. Group.</w:t>
+              <w:t>Pairs:</w:t>
+            </w:r>
+            <w:r>
+              <w:rPr>
+                <w:b w:val="0"/>
+                <w:i w:val="0"/>
+                <w:sz w:val="22"/>
+              </w:rPr>
+              <w:t xml:space="preserve"> turn to a neighbor; with an odd number, make one group of 3. </w:t>
+            </w:r>
+            <w:r>
+              <w:rPr>
+                <w:b w:val="0"/>
+                <w:i/>
+                <w:sz w:val="22"/>
+              </w:rPr>
+              <w:t>Groups:</w:t>
+            </w:r>
+            <w:r>
+              <w:rPr>
+                <w:b w:val="0"/>
+                <w:i w:val="0"/>
+                <w:sz w:val="22"/>
+              </w:rPr>
+              <w:t xml:space="preserve"> 3–4 learners. </w:t>
+            </w:r>
+            <w:r>
+              <w:rPr>
+                <w:b w:val="0"/>
+                <w:i/>
+                <w:sz w:val="22"/>
+              </w:rPr>
+              <w:t>Mingle:</w:t>
+            </w:r>
+            <w:r>
+              <w:rPr>
+                <w:b w:val="0"/>
+                <w:i w:val="0"/>
+                <w:sz w:val="22"/>
+              </w:rPr>
+              <w:t xml:space="preserve"> everyone stands and talks to many classmates. The teacher joins a pair only if one learner is left over.</w:t>
             </w:r>
           </w:p>
         </w:tc>
@@ -1577,7 +1609,7 @@
                 <w:i w:val="0"/>
                 <w:sz w:val="22"/>
               </w:rPr>
-              <w:t>Grouping toolkit:</w:t>
+              <w:t>When a learner is stuck or speaks another language to you:</w:t>
             </w:r>
             <w:r>
               <w:rPr>
@@ -1585,117 +1617,7 @@
                 <w:i w:val="0"/>
                 <w:sz w:val="22"/>
               </w:rPr>
-              <w:t xml:space="preserve"> </w:t>
-            </w:r>
-            <w:r>
-              <w:rPr>
-                <w:b w:val="0"/>
-                <w:i/>
-                <w:sz w:val="22"/>
-              </w:rPr>
-              <w:t>Pairs:</w:t>
-            </w:r>
-            <w:r>
-              <w:rPr>
-                <w:b w:val="0"/>
-                <w:i w:val="0"/>
-                <w:sz w:val="22"/>
-              </w:rPr>
-              <w:t xml:space="preserve"> turn to a neighbor; with an odd number, make one group of 3. </w:t>
-            </w:r>
-            <w:r>
-              <w:rPr>
-                <w:b w:val="0"/>
-                <w:i/>
-                <w:sz w:val="22"/>
-              </w:rPr>
-              <w:t>Groups:</w:t>
-            </w:r>
-            <w:r>
-              <w:rPr>
-                <w:b w:val="0"/>
-                <w:i w:val="0"/>
-                <w:sz w:val="22"/>
-              </w:rPr>
-              <w:t xml:space="preserve"> 3–4 learners. </w:t>
-            </w:r>
-            <w:r>
-              <w:rPr>
-                <w:b w:val="0"/>
-                <w:i/>
-                <w:sz w:val="22"/>
-              </w:rPr>
-              <w:t>Mingle:</w:t>
-            </w:r>
-            <w:r>
-              <w:rPr>
-                <w:b w:val="0"/>
-                <w:i w:val="0"/>
-                <w:sz w:val="22"/>
-              </w:rPr>
-              <w:t xml:space="preserve"> everyone stands and talks to many classmates. The teacher joins a pair only if one learner is left over.</w:t>
-            </w:r>
-          </w:p>
-        </w:tc>
-      </w:tr>
-    </w:tbl>
-    <w:p>
-      <w:pPr>
-        <w:spacing w:after="200" w:before="0" w:line="240" w:lineRule="auto"/>
-      </w:pPr>
-      <w:r>
-        <w:rPr>
-          <w:sz w:val="8"/>
-        </w:rPr>
-      </w:r>
-    </w:p>
-    <w:tbl>
-      <w:tblPr>
-        <w:tblW w:type="auto" w:w="0"/>
-        <w:jc w:val="center"/>
-        <w:tblLayout w:type="fixed"/>
-        <w:tblLook w:firstColumn="1" w:firstRow="1" w:lastColumn="0" w:lastRow="0" w:noHBand="0" w:noVBand="1" w:val="04A0"/>
-        <w:tblCellMar>
-          <w:top w:w="90" w:type="dxa"/>
-          <w:left w:w="150" w:type="dxa"/>
-          <w:bottom w:w="90" w:type="dxa"/>
-          <w:right w:w="150" w:type="dxa"/>
-        </w:tblCellMar>
-      </w:tblPr>
-      <w:tblGrid>
-        <w:gridCol w:w="9648"/>
-      </w:tblGrid>
-      <w:tr>
-        <w:tc>
-          <w:tcPr>
-            <w:tcW w:type="dxa" w:w="9648"/>
-            <w:shd w:val="clear" w:color="auto" w:fill="EAF4F4"/>
-            <w:tcBorders>
-              <w:top w:val="nil"/>
-              <w:left w:val="single" w:sz="24" w:color="1B6F7A"/>
-              <w:bottom w:val="nil"/>
-              <w:right w:val="nil"/>
-            </w:tcBorders>
-          </w:tcPr>
-          <w:p>
-            <w:pPr>
-              <w:spacing w:after="40" w:before="0" w:line="276" w:lineRule="auto"/>
-            </w:pPr>
-            <w:r>
-              <w:rPr>
-                <w:b/>
-                <w:i w:val="0"/>
-                <w:sz w:val="22"/>
-              </w:rPr>
-              <w:t>When a learner is stuck or speaks another language to you:</w:t>
-            </w:r>
-            <w:r>
-              <w:rPr>
-                <w:b w:val="0"/>
-                <w:i w:val="0"/>
-                <w:sz w:val="22"/>
-              </w:rPr>
-              <w:t xml:space="preserve"> (1) show it: the picture, a gesture, or the board; (2) give one more short English example; (3) point to the icon and the grammar box on their page; (4) a classmate can help for a few seconds, then back to English. You don't need to understand what classmates say to each other.</w:t>
+              <w:t xml:space="preserve"> (1) show it: the picture, a gesture, or the board; (2) give one more short English example; (3) point to the instruction and the grammar box on their page; (4) a classmate can help for a few seconds, then back to English. You don't need to understand what classmates say to each other.</w:t>
             </w:r>
           </w:p>
         </w:tc>
@@ -2688,10 +2610,10 @@
       </w:tblPr>
       <w:tblGrid>
         <w:gridCol w:w="1655"/>
-        <w:gridCol w:w="3312"/>
+        <w:gridCol w:w="3320"/>
         <w:gridCol w:w="792"/>
-        <w:gridCol w:w="1477"/>
-        <w:gridCol w:w="2410"/>
+        <w:gridCol w:w="1501"/>
+        <w:gridCol w:w="2378"/>
       </w:tblGrid>
       <w:tr>
         <w:trPr>
@@ -2722,7 +2644,7 @@
         </w:tc>
         <w:tc>
           <w:tcPr>
-            <w:tcW w:type="dxa" w:w="3312"/>
+            <w:tcW w:type="dxa" w:w="3321"/>
             <w:vAlign w:val="center"/>
             <w:shd w:val="clear" w:color="auto" w:fill="1F3A5F"/>
           </w:tcPr>
@@ -2766,7 +2688,7 @@
         </w:tc>
         <w:tc>
           <w:tcPr>
-            <w:tcW w:type="dxa" w:w="1477"/>
+            <w:tcW w:type="dxa" w:w="1501"/>
             <w:vAlign w:val="center"/>
             <w:shd w:val="clear" w:color="auto" w:fill="1F3A5F"/>
           </w:tcPr>
@@ -2788,7 +2710,7 @@
         </w:tc>
         <w:tc>
           <w:tcPr>
-            <w:tcW w:type="dxa" w:w="2411"/>
+            <w:tcW w:type="dxa" w:w="2378"/>
             <w:vAlign w:val="center"/>
             <w:shd w:val="clear" w:color="auto" w:fill="1F3A5F"/>
           </w:tcPr>
@@ -2835,7 +2757,7 @@
         </w:tc>
         <w:tc>
           <w:tcPr>
-            <w:tcW w:type="dxa" w:w="3312"/>
+            <w:tcW w:type="dxa" w:w="3321"/>
             <w:vAlign w:val="center"/>
           </w:tcPr>
           <w:p>
@@ -2883,7 +2805,7 @@
         </w:tc>
         <w:tc>
           <w:tcPr>
-            <w:tcW w:type="dxa" w:w="1477"/>
+            <w:tcW w:type="dxa" w:w="1501"/>
             <w:vAlign w:val="center"/>
           </w:tcPr>
           <w:p>
@@ -2903,7 +2825,7 @@
         </w:tc>
         <w:tc>
           <w:tcPr>
-            <w:tcW w:type="dxa" w:w="2411"/>
+            <w:tcW w:type="dxa" w:w="2378"/>
             <w:vAlign w:val="center"/>
           </w:tcPr>
           <w:p>
@@ -2949,7 +2871,7 @@
         </w:tc>
         <w:tc>
           <w:tcPr>
-            <w:tcW w:type="dxa" w:w="3312"/>
+            <w:tcW w:type="dxa" w:w="3321"/>
             <w:vAlign w:val="center"/>
             <w:shd w:val="clear" w:color="auto" w:fill="EEF4F7"/>
           </w:tcPr>
@@ -2972,7 +2894,7 @@
                 <w:i w:val="0"/>
                 <w:sz w:val="21"/>
               </w:rPr>
-              <w:t xml:space="preserve"> How Our Class Works + the icons</w:t>
+              <w:t xml:space="preserve"> How Our Class Works</w:t>
             </w:r>
           </w:p>
         </w:tc>
@@ -2999,7 +2921,7 @@
         </w:tc>
         <w:tc>
           <w:tcPr>
-            <w:tcW w:type="dxa" w:w="1477"/>
+            <w:tcW w:type="dxa" w:w="1501"/>
             <w:vAlign w:val="center"/>
             <w:shd w:val="clear" w:color="auto" w:fill="EEF4F7"/>
           </w:tcPr>
@@ -3020,7 +2942,7 @@
         </w:tc>
         <w:tc>
           <w:tcPr>
-            <w:tcW w:type="dxa" w:w="2411"/>
+            <w:tcW w:type="dxa" w:w="2378"/>
             <w:vAlign w:val="center"/>
             <w:shd w:val="clear" w:color="auto" w:fill="EEF4F7"/>
           </w:tcPr>
@@ -3035,7 +2957,7 @@
                 <w:i w:val="0"/>
                 <w:sz w:val="21"/>
               </w:rPr>
-              <w:t>Show the icon key; say the 3 rules only</w:t>
+              <w:t>Say the 3 rules only</w:t>
             </w:r>
           </w:p>
         </w:tc>
@@ -3066,7 +2988,7 @@
         </w:tc>
         <w:tc>
           <w:tcPr>
-            <w:tcW w:type="dxa" w:w="3312"/>
+            <w:tcW w:type="dxa" w:w="3321"/>
             <w:vAlign w:val="center"/>
           </w:tcPr>
           <w:p>
@@ -3114,7 +3036,7 @@
         </w:tc>
         <w:tc>
           <w:tcPr>
-            <w:tcW w:type="dxa" w:w="1477"/>
+            <w:tcW w:type="dxa" w:w="1501"/>
             <w:vAlign w:val="center"/>
           </w:tcPr>
           <w:p>
@@ -3134,7 +3056,7 @@
         </w:tc>
         <w:tc>
           <w:tcPr>
-            <w:tcW w:type="dxa" w:w="2411"/>
+            <w:tcW w:type="dxa" w:w="2378"/>
             <w:vAlign w:val="center"/>
           </w:tcPr>
           <w:p>
@@ -3197,7 +3119,7 @@
         </w:tc>
         <w:tc>
           <w:tcPr>
-            <w:tcW w:type="dxa" w:w="3312"/>
+            <w:tcW w:type="dxa" w:w="3321"/>
             <w:vAlign w:val="center"/>
             <w:shd w:val="clear" w:color="auto" w:fill="EEF4F7"/>
           </w:tcPr>
@@ -3247,7 +3169,7 @@
         </w:tc>
         <w:tc>
           <w:tcPr>
-            <w:tcW w:type="dxa" w:w="1477"/>
+            <w:tcW w:type="dxa" w:w="1501"/>
             <w:vAlign w:val="center"/>
             <w:shd w:val="clear" w:color="auto" w:fill="EEF4F7"/>
           </w:tcPr>
@@ -3268,7 +3190,7 @@
         </w:tc>
         <w:tc>
           <w:tcPr>
-            <w:tcW w:type="dxa" w:w="2411"/>
+            <w:tcW w:type="dxa" w:w="2378"/>
             <w:vAlign w:val="center"/>
             <w:shd w:val="clear" w:color="auto" w:fill="EEF4F7"/>
           </w:tcPr>
@@ -3314,7 +3236,7 @@
         </w:tc>
         <w:tc>
           <w:tcPr>
-            <w:tcW w:type="dxa" w:w="3312"/>
+            <w:tcW w:type="dxa" w:w="3321"/>
             <w:vAlign w:val="center"/>
           </w:tcPr>
           <w:p>
@@ -3378,7 +3300,7 @@
         </w:tc>
         <w:tc>
           <w:tcPr>
-            <w:tcW w:type="dxa" w:w="1477"/>
+            <w:tcW w:type="dxa" w:w="1501"/>
             <w:vAlign w:val="center"/>
           </w:tcPr>
           <w:p>
@@ -3398,7 +3320,7 @@
         </w:tc>
         <w:tc>
           <w:tcPr>
-            <w:tcW w:type="dxa" w:w="2411"/>
+            <w:tcW w:type="dxa" w:w="2378"/>
             <w:vAlign w:val="center"/>
           </w:tcPr>
           <w:p>
@@ -3444,7 +3366,7 @@
         </w:tc>
         <w:tc>
           <w:tcPr>
-            <w:tcW w:type="dxa" w:w="3312"/>
+            <w:tcW w:type="dxa" w:w="3321"/>
             <w:vAlign w:val="center"/>
             <w:shd w:val="clear" w:color="auto" w:fill="EEF4F7"/>
           </w:tcPr>
@@ -3486,7 +3408,7 @@
         </w:tc>
         <w:tc>
           <w:tcPr>
-            <w:tcW w:type="dxa" w:w="1477"/>
+            <w:tcW w:type="dxa" w:w="1501"/>
             <w:vAlign w:val="center"/>
             <w:shd w:val="clear" w:color="auto" w:fill="EEF4F7"/>
           </w:tcPr>
@@ -3499,7 +3421,7 @@
         </w:tc>
         <w:tc>
           <w:tcPr>
-            <w:tcW w:type="dxa" w:w="2411"/>
+            <w:tcW w:type="dxa" w:w="2378"/>
             <w:vAlign w:val="center"/>
             <w:shd w:val="clear" w:color="auto" w:fill="EEF4F7"/>
           </w:tcPr>
@@ -3537,7 +3459,7 @@
         </w:tc>
         <w:tc>
           <w:tcPr>
-            <w:tcW w:type="dxa" w:w="3312"/>
+            <w:tcW w:type="dxa" w:w="3321"/>
             <w:vAlign w:val="center"/>
           </w:tcPr>
           <w:p>
@@ -3585,7 +3507,7 @@
         </w:tc>
         <w:tc>
           <w:tcPr>
-            <w:tcW w:type="dxa" w:w="1477"/>
+            <w:tcW w:type="dxa" w:w="1501"/>
             <w:vAlign w:val="center"/>
           </w:tcPr>
           <w:p>
@@ -3605,7 +3527,7 @@
         </w:tc>
         <w:tc>
           <w:tcPr>
-            <w:tcW w:type="dxa" w:w="2411"/>
+            <w:tcW w:type="dxa" w:w="2378"/>
             <w:vAlign w:val="center"/>
           </w:tcPr>
           <w:p>
@@ -3651,7 +3573,7 @@
         </w:tc>
         <w:tc>
           <w:tcPr>
-            <w:tcW w:type="dxa" w:w="3312"/>
+            <w:tcW w:type="dxa" w:w="3321"/>
             <w:vAlign w:val="center"/>
             <w:shd w:val="clear" w:color="auto" w:fill="EEF4F7"/>
           </w:tcPr>
@@ -3693,7 +3615,7 @@
         </w:tc>
         <w:tc>
           <w:tcPr>
-            <w:tcW w:type="dxa" w:w="1477"/>
+            <w:tcW w:type="dxa" w:w="1501"/>
             <w:vAlign w:val="center"/>
             <w:shd w:val="clear" w:color="auto" w:fill="EEF4F7"/>
           </w:tcPr>
@@ -3714,7 +3636,7 @@
         </w:tc>
         <w:tc>
           <w:tcPr>
-            <w:tcW w:type="dxa" w:w="2411"/>
+            <w:tcW w:type="dxa" w:w="2378"/>
             <w:vAlign w:val="center"/>
             <w:shd w:val="clear" w:color="auto" w:fill="EEF4F7"/>
           </w:tcPr>
@@ -3760,7 +3682,7 @@
         </w:tc>
         <w:tc>
           <w:tcPr>
-            <w:tcW w:type="dxa" w:w="3312"/>
+            <w:tcW w:type="dxa" w:w="3321"/>
             <w:vAlign w:val="center"/>
           </w:tcPr>
           <w:p>
@@ -3808,7 +3730,7 @@
         </w:tc>
         <w:tc>
           <w:tcPr>
-            <w:tcW w:type="dxa" w:w="1477"/>
+            <w:tcW w:type="dxa" w:w="1501"/>
             <w:vAlign w:val="center"/>
           </w:tcPr>
           <w:p>
@@ -3828,7 +3750,7 @@
         </w:tc>
         <w:tc>
           <w:tcPr>
-            <w:tcW w:type="dxa" w:w="2411"/>
+            <w:tcW w:type="dxa" w:w="2378"/>
             <w:vAlign w:val="center"/>
           </w:tcPr>
           <w:p>
@@ -3873,7 +3795,7 @@
         </w:tc>
         <w:tc>
           <w:tcPr>
-            <w:tcW w:type="dxa" w:w="3312"/>
+            <w:tcW w:type="dxa" w:w="3321"/>
             <w:vAlign w:val="center"/>
             <w:shd w:val="clear" w:color="auto" w:fill="EEF4F7"/>
           </w:tcPr>
@@ -3921,7 +3843,7 @@
         </w:tc>
         <w:tc>
           <w:tcPr>
-            <w:tcW w:type="dxa" w:w="1477"/>
+            <w:tcW w:type="dxa" w:w="1501"/>
             <w:vAlign w:val="center"/>
             <w:shd w:val="clear" w:color="auto" w:fill="EEF4F7"/>
           </w:tcPr>
@@ -3941,7 +3863,7 @@
         </w:tc>
         <w:tc>
           <w:tcPr>
-            <w:tcW w:type="dxa" w:w="2411"/>
+            <w:tcW w:type="dxa" w:w="2378"/>
             <w:vAlign w:val="center"/>
             <w:shd w:val="clear" w:color="auto" w:fill="EEF4F7"/>
           </w:tcPr>
@@ -4635,7 +4557,7 @@
                 <w:i w:val="0"/>
                 <w:sz w:val="23"/>
               </w:rPr>
-              <w:t>Show the icons:</w:t>
+              <w:t>Show the instruction words:</w:t>
             </w:r>
             <w:r>
               <w:rPr>
@@ -4643,7 +4565,7 @@
                 <w:i w:val="0"/>
                 <w:sz w:val="23"/>
               </w:rPr>
-              <w:t xml:space="preserve"> point to each icon on the key and do the action: 👂 (hand to ear) "Listen." 🗣️ "Say." ✏️ (mime writing) "Write." 👥 (point to two people) "Partner." Learners copy your gesture.</w:t>
+              <w:t xml:space="preserve"> say each word and do the action: (hand to ear) "Listen." "Say." (mime writing) "Write." (point to two people) "Partner." Learners copy your gesture.</w:t>
             </w:r>
           </w:p>
           <w:p>
@@ -4673,7 +4595,7 @@
                 <w:i w:val="0"/>
                 <w:sz w:val="23"/>
               </w:rPr>
-              <w:t xml:space="preserve"> "Write your language here," and point to the "My language" column. Learners can fill it in now or at home. </w:t>
+              <w:t xml:space="preserve"> "Write your language here," and point to a "My language" line. Learners can fill it in now or at home. </w:t>
             </w:r>
             <w:r>
               <w:rPr>
@@ -4819,7 +4741,7 @@
                 <w:i w:val="0"/>
                 <w:sz w:val="23"/>
               </w:rPr>
-              <w:t xml:space="preserve"> show the icon key and say the 3 rules only.</w:t>
+              <w:t xml:space="preserve"> say the 3 rules only.</w:t>
             </w:r>
           </w:p>
         </w:tc>
@@ -6618,7 +6540,7 @@
                 <w:i w:val="0"/>
                 <w:sz w:val="23"/>
               </w:rPr>
-              <w:t xml:space="preserve"> open the Homework page. Do item 1 together. Point to each icon so learners know what to do at home.</w:t>
+              <w:t xml:space="preserve"> open the Homework page. Do item 1 together. Point to each instruction so learners know what to do at home.</w:t>
             </w:r>
           </w:p>
         </w:tc>
@@ -9674,7 +9596,7 @@
           <w:color w:val="555555"/>
           <w:sz w:val="28"/>
         </w:rPr>
-        <w:t>The Icons · How Our Class Works · New Words · Listening · Grammar · Talk Time · Homework · Letters &amp; Numbers · Progress Check</w:t>
+        <w:t>How Our Class Works · New Words · Listening · Grammar · Talk Time · Homework · Letters &amp; Numbers · Progress Check</w:t>
       </w:r>
     </w:p>
     <w:p>
@@ -9685,1245 +9607,6 @@
     <w:p>
       <w:pPr>
         <w:keepNext/>
-        <w:spacing w:after="200" w:before="0" w:line="252" w:lineRule="auto"/>
-        <w:pBdr>
-          <w:bottom w:val="single" w:sz="10" w:space="4" w:color="1B6F7A"/>
-        </w:pBdr>
-      </w:pPr>
-      <w:r>
-        <w:rPr>
-          <w:b/>
-          <w:i w:val="0"/>
-          <w:color w:val="1F3A5F"/>
-          <w:sz w:val="44"/>
-        </w:rPr>
-        <w:t>How to Use This Workbook: The Icons</w:t>
-      </w:r>
-    </w:p>
-    <w:p>
-      <w:pPr>
-        <w:spacing w:after="180" w:before="0" w:line="300" w:lineRule="auto"/>
-      </w:pPr>
-      <w:r>
-        <w:rPr>
-          <w:b w:val="0"/>
-          <w:i w:val="0"/>
-          <w:sz w:val="26"/>
-        </w:rPr>
-        <w:t>Name: ______________________________     Date: ________________</w:t>
-      </w:r>
-    </w:p>
-    <w:p>
-      <w:pPr>
-        <w:spacing w:after="180" w:before="0" w:line="300" w:lineRule="auto"/>
-      </w:pPr>
-      <w:r>
-        <w:rPr>
-          <w:b w:val="0"/>
-          <w:i/>
-          <w:sz w:val="26"/>
-        </w:rPr>
-        <w:t>Every task has an icon. Look at the icon. It tells you what to do.</w:t>
-      </w:r>
-      <w:r>
-        <w:rPr>
-          <w:b w:val="0"/>
-          <w:i w:val="0"/>
-          <w:sz w:val="26"/>
-        </w:rPr>
-        <w:t xml:space="preserve"> Write each instruction in your language, if you want.</w:t>
-      </w:r>
-    </w:p>
-    <w:tbl>
-      <w:tblPr>
-        <w:tblStyle w:val="TableGrid"/>
-        <w:tblW w:type="auto" w:w="0"/>
-        <w:jc w:val="center"/>
-        <w:tblLayout w:type="fixed"/>
-        <w:tblLook w:firstColumn="1" w:firstRow="1" w:lastColumn="0" w:lastRow="0" w:noHBand="0" w:noVBand="1" w:val="04A0"/>
-        <w:tblCellMar>
-          <w:top w:w="60" w:type="dxa"/>
-          <w:left w:w="100" w:type="dxa"/>
-          <w:bottom w:w="60" w:type="dxa"/>
-          <w:right w:w="100" w:type="dxa"/>
-        </w:tblCellMar>
-      </w:tblPr>
-      <w:tblGrid>
-        <w:gridCol w:w="1564"/>
-        <w:gridCol w:w="2958"/>
-        <w:gridCol w:w="3561"/>
-        <w:gridCol w:w="1564"/>
-      </w:tblGrid>
-      <w:tr>
-        <w:trPr>
-          <w:cantSplit/>
-          <w:tblHeader/>
-        </w:trPr>
-        <w:tc>
-          <w:tcPr>
-            <w:tcW w:type="dxa" w:w="1564"/>
-            <w:vAlign w:val="center"/>
-            <w:shd w:val="clear" w:color="auto" w:fill="1F3A5F"/>
-          </w:tcPr>
-          <w:p>
-            <w:pPr>
-              <w:keepNext/>
-              <w:spacing w:after="0" w:before="0" w:line="264" w:lineRule="auto"/>
-            </w:pPr>
-            <w:r>
-              <w:rPr>
-                <w:b/>
-                <w:i w:val="0"/>
-                <w:color w:val="FFFFFF"/>
-                <w:sz w:val="24"/>
-              </w:rPr>
-              <w:t>Icon</w:t>
-            </w:r>
-          </w:p>
-        </w:tc>
-        <w:tc>
-          <w:tcPr>
-            <w:tcW w:type="dxa" w:w="2958"/>
-            <w:vAlign w:val="center"/>
-            <w:shd w:val="clear" w:color="auto" w:fill="1F3A5F"/>
-          </w:tcPr>
-          <w:p>
-            <w:pPr>
-              <w:keepNext/>
-              <w:spacing w:after="0" w:before="0" w:line="264" w:lineRule="auto"/>
-            </w:pPr>
-            <w:r>
-              <w:rPr>
-                <w:b/>
-                <w:i w:val="0"/>
-                <w:color w:val="FFFFFF"/>
-                <w:sz w:val="24"/>
-              </w:rPr>
-              <w:t>English</w:t>
-            </w:r>
-          </w:p>
-        </w:tc>
-        <w:tc>
-          <w:tcPr>
-            <w:tcW w:type="dxa" w:w="3562"/>
-            <w:vAlign w:val="center"/>
-            <w:shd w:val="clear" w:color="auto" w:fill="1F3A5F"/>
-          </w:tcPr>
-          <w:p>
-            <w:pPr>
-              <w:keepNext/>
-              <w:spacing w:after="0" w:before="0" w:line="264" w:lineRule="auto"/>
-            </w:pPr>
-            <w:r>
-              <w:rPr>
-                <w:b/>
-                <w:i w:val="0"/>
-                <w:color w:val="FFFFFF"/>
-                <w:sz w:val="24"/>
-              </w:rPr>
-              <w:t>Español</w:t>
-            </w:r>
-          </w:p>
-        </w:tc>
-        <w:tc>
-          <w:tcPr>
-            <w:tcW w:type="dxa" w:w="1564"/>
-            <w:vAlign w:val="center"/>
-            <w:shd w:val="clear" w:color="auto" w:fill="1F3A5F"/>
-          </w:tcPr>
-          <w:p>
-            <w:pPr>
-              <w:keepNext/>
-              <w:spacing w:after="0" w:before="0" w:line="264" w:lineRule="auto"/>
-            </w:pPr>
-            <w:r>
-              <w:rPr>
-                <w:b/>
-                <w:i w:val="0"/>
-                <w:color w:val="FFFFFF"/>
-                <w:sz w:val="24"/>
-              </w:rPr>
-              <w:t>My language</w:t>
-            </w:r>
-          </w:p>
-        </w:tc>
-      </w:tr>
-      <w:tr>
-        <w:trPr>
-          <w:cantSplit/>
-        </w:trPr>
-        <w:tc>
-          <w:tcPr>
-            <w:tcW w:type="dxa" w:w="1564"/>
-            <w:vAlign w:val="center"/>
-          </w:tcPr>
-          <w:p>
-            <w:pPr>
-              <w:keepNext/>
-              <w:spacing w:after="0" w:before="0" w:line="264" w:lineRule="auto"/>
-            </w:pPr>
-            <w:r>
-              <w:rPr>
-                <w:b w:val="0"/>
-                <w:i w:val="0"/>
-                <w:sz w:val="24"/>
-              </w:rPr>
-              <w:t>👂</w:t>
-            </w:r>
-          </w:p>
-        </w:tc>
-        <w:tc>
-          <w:tcPr>
-            <w:tcW w:type="dxa" w:w="2958"/>
-            <w:vAlign w:val="center"/>
-          </w:tcPr>
-          <w:p>
-            <w:pPr>
-              <w:keepNext/>
-              <w:spacing w:after="0" w:before="0" w:line="264" w:lineRule="auto"/>
-            </w:pPr>
-            <w:r>
-              <w:rPr>
-                <w:b w:val="0"/>
-                <w:i w:val="0"/>
-                <w:sz w:val="24"/>
-              </w:rPr>
-              <w:t>Listen.</w:t>
-            </w:r>
-          </w:p>
-        </w:tc>
-        <w:tc>
-          <w:tcPr>
-            <w:tcW w:type="dxa" w:w="3562"/>
-            <w:vAlign w:val="center"/>
-          </w:tcPr>
-          <w:p>
-            <w:pPr>
-              <w:keepNext/>
-              <w:spacing w:after="0" w:before="0" w:line="264" w:lineRule="auto"/>
-            </w:pPr>
-            <w:r>
-              <w:rPr>
-                <w:b w:val="0"/>
-                <w:i w:val="0"/>
-                <w:sz w:val="24"/>
-              </w:rPr>
-              <w:t>Escucha.</w:t>
-            </w:r>
-          </w:p>
-        </w:tc>
-        <w:tc>
-          <w:tcPr>
-            <w:tcW w:type="dxa" w:w="1564"/>
-            <w:vAlign w:val="center"/>
-          </w:tcPr>
-          <w:p>
-            <w:pPr>
-              <w:keepNext/>
-              <w:spacing w:after="0" w:before="0" w:line="264" w:lineRule="auto"/>
-            </w:pPr>
-            <w:r>
-              <w:br/>
-            </w:r>
-          </w:p>
-        </w:tc>
-      </w:tr>
-      <w:tr>
-        <w:trPr>
-          <w:cantSplit/>
-        </w:trPr>
-        <w:tc>
-          <w:tcPr>
-            <w:tcW w:type="dxa" w:w="1564"/>
-            <w:vAlign w:val="center"/>
-            <w:shd w:val="clear" w:color="auto" w:fill="EEF4F7"/>
-          </w:tcPr>
-          <w:p>
-            <w:pPr>
-              <w:keepNext/>
-              <w:spacing w:after="0" w:before="0" w:line="264" w:lineRule="auto"/>
-            </w:pPr>
-            <w:r>
-              <w:rPr>
-                <w:b w:val="0"/>
-                <w:i w:val="0"/>
-                <w:sz w:val="24"/>
-              </w:rPr>
-              <w:t>🗣️</w:t>
-            </w:r>
-          </w:p>
-        </w:tc>
-        <w:tc>
-          <w:tcPr>
-            <w:tcW w:type="dxa" w:w="2958"/>
-            <w:vAlign w:val="center"/>
-            <w:shd w:val="clear" w:color="auto" w:fill="EEF4F7"/>
-          </w:tcPr>
-          <w:p>
-            <w:pPr>
-              <w:keepNext/>
-              <w:spacing w:after="0" w:before="0" w:line="264" w:lineRule="auto"/>
-            </w:pPr>
-            <w:r>
-              <w:rPr>
-                <w:b w:val="0"/>
-                <w:i w:val="0"/>
-                <w:sz w:val="24"/>
-              </w:rPr>
-              <w:t>Say. Repeat.</w:t>
-            </w:r>
-          </w:p>
-        </w:tc>
-        <w:tc>
-          <w:tcPr>
-            <w:tcW w:type="dxa" w:w="3562"/>
-            <w:vAlign w:val="center"/>
-            <w:shd w:val="clear" w:color="auto" w:fill="EEF4F7"/>
-          </w:tcPr>
-          <w:p>
-            <w:pPr>
-              <w:keepNext/>
-              <w:spacing w:after="0" w:before="0" w:line="264" w:lineRule="auto"/>
-            </w:pPr>
-            <w:r>
-              <w:rPr>
-                <w:b w:val="0"/>
-                <w:i w:val="0"/>
-                <w:sz w:val="24"/>
-              </w:rPr>
-              <w:t>Di. Repite.</w:t>
-            </w:r>
-          </w:p>
-        </w:tc>
-        <w:tc>
-          <w:tcPr>
-            <w:tcW w:type="dxa" w:w="1564"/>
-            <w:vAlign w:val="center"/>
-            <w:shd w:val="clear" w:color="auto" w:fill="EEF4F7"/>
-          </w:tcPr>
-          <w:p>
-            <w:pPr>
-              <w:keepNext/>
-              <w:spacing w:after="0" w:before="0" w:line="264" w:lineRule="auto"/>
-            </w:pPr>
-            <w:r>
-              <w:br/>
-            </w:r>
-          </w:p>
-        </w:tc>
-      </w:tr>
-      <w:tr>
-        <w:trPr>
-          <w:cantSplit/>
-        </w:trPr>
-        <w:tc>
-          <w:tcPr>
-            <w:tcW w:type="dxa" w:w="1564"/>
-            <w:vAlign w:val="center"/>
-          </w:tcPr>
-          <w:p>
-            <w:pPr>
-              <w:keepNext/>
-              <w:spacing w:after="0" w:before="0" w:line="264" w:lineRule="auto"/>
-            </w:pPr>
-            <w:r>
-              <w:rPr>
-                <w:b w:val="0"/>
-                <w:i w:val="0"/>
-                <w:sz w:val="24"/>
-              </w:rPr>
-              <w:t>📖</w:t>
-            </w:r>
-          </w:p>
-        </w:tc>
-        <w:tc>
-          <w:tcPr>
-            <w:tcW w:type="dxa" w:w="2958"/>
-            <w:vAlign w:val="center"/>
-          </w:tcPr>
-          <w:p>
-            <w:pPr>
-              <w:keepNext/>
-              <w:spacing w:after="0" w:before="0" w:line="264" w:lineRule="auto"/>
-            </w:pPr>
-            <w:r>
-              <w:rPr>
-                <w:b w:val="0"/>
-                <w:i w:val="0"/>
-                <w:sz w:val="24"/>
-              </w:rPr>
-              <w:t>Read.</w:t>
-            </w:r>
-          </w:p>
-        </w:tc>
-        <w:tc>
-          <w:tcPr>
-            <w:tcW w:type="dxa" w:w="3562"/>
-            <w:vAlign w:val="center"/>
-          </w:tcPr>
-          <w:p>
-            <w:pPr>
-              <w:keepNext/>
-              <w:spacing w:after="0" w:before="0" w:line="264" w:lineRule="auto"/>
-            </w:pPr>
-            <w:r>
-              <w:rPr>
-                <w:b w:val="0"/>
-                <w:i w:val="0"/>
-                <w:sz w:val="24"/>
-              </w:rPr>
-              <w:t>Lee.</w:t>
-            </w:r>
-          </w:p>
-        </w:tc>
-        <w:tc>
-          <w:tcPr>
-            <w:tcW w:type="dxa" w:w="1564"/>
-            <w:vAlign w:val="center"/>
-          </w:tcPr>
-          <w:p>
-            <w:pPr>
-              <w:keepNext/>
-              <w:spacing w:after="0" w:before="0" w:line="264" w:lineRule="auto"/>
-            </w:pPr>
-            <w:r>
-              <w:br/>
-            </w:r>
-          </w:p>
-        </w:tc>
-      </w:tr>
-      <w:tr>
-        <w:trPr>
-          <w:cantSplit/>
-        </w:trPr>
-        <w:tc>
-          <w:tcPr>
-            <w:tcW w:type="dxa" w:w="1564"/>
-            <w:vAlign w:val="center"/>
-            <w:shd w:val="clear" w:color="auto" w:fill="EEF4F7"/>
-          </w:tcPr>
-          <w:p>
-            <w:pPr>
-              <w:keepNext/>
-              <w:spacing w:after="0" w:before="0" w:line="264" w:lineRule="auto"/>
-            </w:pPr>
-            <w:r>
-              <w:rPr>
-                <w:b w:val="0"/>
-                <w:i w:val="0"/>
-                <w:sz w:val="24"/>
-              </w:rPr>
-              <w:t>✏️</w:t>
-            </w:r>
-          </w:p>
-        </w:tc>
-        <w:tc>
-          <w:tcPr>
-            <w:tcW w:type="dxa" w:w="2958"/>
-            <w:vAlign w:val="center"/>
-            <w:shd w:val="clear" w:color="auto" w:fill="EEF4F7"/>
-          </w:tcPr>
-          <w:p>
-            <w:pPr>
-              <w:keepNext/>
-              <w:spacing w:after="0" w:before="0" w:line="264" w:lineRule="auto"/>
-            </w:pPr>
-            <w:r>
-              <w:rPr>
-                <w:b w:val="0"/>
-                <w:i w:val="0"/>
-                <w:sz w:val="24"/>
-              </w:rPr>
-              <w:t>Write.</w:t>
-            </w:r>
-          </w:p>
-        </w:tc>
-        <w:tc>
-          <w:tcPr>
-            <w:tcW w:type="dxa" w:w="3562"/>
-            <w:vAlign w:val="center"/>
-            <w:shd w:val="clear" w:color="auto" w:fill="EEF4F7"/>
-          </w:tcPr>
-          <w:p>
-            <w:pPr>
-              <w:keepNext/>
-              <w:spacing w:after="0" w:before="0" w:line="264" w:lineRule="auto"/>
-            </w:pPr>
-            <w:r>
-              <w:rPr>
-                <w:b w:val="0"/>
-                <w:i w:val="0"/>
-                <w:sz w:val="24"/>
-              </w:rPr>
-              <w:t>Escribe.</w:t>
-            </w:r>
-          </w:p>
-        </w:tc>
-        <w:tc>
-          <w:tcPr>
-            <w:tcW w:type="dxa" w:w="1564"/>
-            <w:vAlign w:val="center"/>
-            <w:shd w:val="clear" w:color="auto" w:fill="EEF4F7"/>
-          </w:tcPr>
-          <w:p>
-            <w:pPr>
-              <w:keepNext/>
-              <w:spacing w:after="0" w:before="0" w:line="264" w:lineRule="auto"/>
-            </w:pPr>
-            <w:r>
-              <w:br/>
-            </w:r>
-          </w:p>
-        </w:tc>
-      </w:tr>
-      <w:tr>
-        <w:trPr>
-          <w:cantSplit/>
-        </w:trPr>
-        <w:tc>
-          <w:tcPr>
-            <w:tcW w:type="dxa" w:w="1564"/>
-            <w:vAlign w:val="center"/>
-          </w:tcPr>
-          <w:p>
-            <w:pPr>
-              <w:keepNext/>
-              <w:spacing w:after="0" w:before="0" w:line="264" w:lineRule="auto"/>
-            </w:pPr>
-            <w:r>
-              <w:rPr>
-                <w:b w:val="0"/>
-                <w:i w:val="0"/>
-                <w:sz w:val="24"/>
-              </w:rPr>
-              <w:t>⭕</w:t>
-            </w:r>
-          </w:p>
-        </w:tc>
-        <w:tc>
-          <w:tcPr>
-            <w:tcW w:type="dxa" w:w="2958"/>
-            <w:vAlign w:val="center"/>
-          </w:tcPr>
-          <w:p>
-            <w:pPr>
-              <w:keepNext/>
-              <w:spacing w:after="0" w:before="0" w:line="264" w:lineRule="auto"/>
-            </w:pPr>
-            <w:r>
-              <w:rPr>
-                <w:b w:val="0"/>
-                <w:i w:val="0"/>
-                <w:sz w:val="24"/>
-              </w:rPr>
-              <w:t>Circle.</w:t>
-            </w:r>
-          </w:p>
-        </w:tc>
-        <w:tc>
-          <w:tcPr>
-            <w:tcW w:type="dxa" w:w="3562"/>
-            <w:vAlign w:val="center"/>
-          </w:tcPr>
-          <w:p>
-            <w:pPr>
-              <w:keepNext/>
-              <w:spacing w:after="0" w:before="0" w:line="264" w:lineRule="auto"/>
-            </w:pPr>
-            <w:r>
-              <w:rPr>
-                <w:b w:val="0"/>
-                <w:i w:val="0"/>
-                <w:sz w:val="24"/>
-              </w:rPr>
-              <w:t>Encierra en un círculo.</w:t>
-            </w:r>
-          </w:p>
-        </w:tc>
-        <w:tc>
-          <w:tcPr>
-            <w:tcW w:type="dxa" w:w="1564"/>
-            <w:vAlign w:val="center"/>
-          </w:tcPr>
-          <w:p>
-            <w:pPr>
-              <w:keepNext/>
-              <w:spacing w:after="0" w:before="0" w:line="264" w:lineRule="auto"/>
-            </w:pPr>
-            <w:r>
-              <w:br/>
-            </w:r>
-          </w:p>
-        </w:tc>
-      </w:tr>
-      <w:tr>
-        <w:trPr>
-          <w:cantSplit/>
-        </w:trPr>
-        <w:tc>
-          <w:tcPr>
-            <w:tcW w:type="dxa" w:w="1564"/>
-            <w:vAlign w:val="center"/>
-            <w:shd w:val="clear" w:color="auto" w:fill="EEF4F7"/>
-          </w:tcPr>
-          <w:p>
-            <w:pPr>
-              <w:keepNext/>
-              <w:spacing w:after="0" w:before="0" w:line="264" w:lineRule="auto"/>
-            </w:pPr>
-            <w:r>
-              <w:rPr>
-                <w:b w:val="0"/>
-                <w:i w:val="0"/>
-                <w:sz w:val="24"/>
-              </w:rPr>
-              <w:t>✅</w:t>
-            </w:r>
-          </w:p>
-        </w:tc>
-        <w:tc>
-          <w:tcPr>
-            <w:tcW w:type="dxa" w:w="2958"/>
-            <w:vAlign w:val="center"/>
-            <w:shd w:val="clear" w:color="auto" w:fill="EEF4F7"/>
-          </w:tcPr>
-          <w:p>
-            <w:pPr>
-              <w:keepNext/>
-              <w:spacing w:after="0" w:before="0" w:line="264" w:lineRule="auto"/>
-            </w:pPr>
-            <w:r>
-              <w:rPr>
-                <w:b w:val="0"/>
-                <w:i w:val="0"/>
-                <w:sz w:val="24"/>
-              </w:rPr>
-              <w:t>Check ✓.</w:t>
-            </w:r>
-          </w:p>
-        </w:tc>
-        <w:tc>
-          <w:tcPr>
-            <w:tcW w:type="dxa" w:w="3562"/>
-            <w:vAlign w:val="center"/>
-            <w:shd w:val="clear" w:color="auto" w:fill="EEF4F7"/>
-          </w:tcPr>
-          <w:p>
-            <w:pPr>
-              <w:keepNext/>
-              <w:spacing w:after="0" w:before="0" w:line="264" w:lineRule="auto"/>
-            </w:pPr>
-            <w:r>
-              <w:rPr>
-                <w:b w:val="0"/>
-                <w:i w:val="0"/>
-                <w:sz w:val="24"/>
-              </w:rPr>
-              <w:t>Marca ✓.</w:t>
-            </w:r>
-          </w:p>
-        </w:tc>
-        <w:tc>
-          <w:tcPr>
-            <w:tcW w:type="dxa" w:w="1564"/>
-            <w:vAlign w:val="center"/>
-            <w:shd w:val="clear" w:color="auto" w:fill="EEF4F7"/>
-          </w:tcPr>
-          <w:p>
-            <w:pPr>
-              <w:keepNext/>
-              <w:spacing w:after="0" w:before="0" w:line="264" w:lineRule="auto"/>
-            </w:pPr>
-            <w:r>
-              <w:br/>
-            </w:r>
-          </w:p>
-        </w:tc>
-      </w:tr>
-      <w:tr>
-        <w:trPr>
-          <w:cantSplit/>
-        </w:trPr>
-        <w:tc>
-          <w:tcPr>
-            <w:tcW w:type="dxa" w:w="1564"/>
-            <w:vAlign w:val="center"/>
-          </w:tcPr>
-          <w:p>
-            <w:pPr>
-              <w:keepNext/>
-              <w:spacing w:after="0" w:before="0" w:line="264" w:lineRule="auto"/>
-            </w:pPr>
-            <w:r>
-              <w:rPr>
-                <w:b w:val="0"/>
-                <w:i w:val="0"/>
-                <w:sz w:val="24"/>
-              </w:rPr>
-              <w:t>☝️</w:t>
-            </w:r>
-          </w:p>
-        </w:tc>
-        <w:tc>
-          <w:tcPr>
-            <w:tcW w:type="dxa" w:w="2958"/>
-            <w:vAlign w:val="center"/>
-          </w:tcPr>
-          <w:p>
-            <w:pPr>
-              <w:keepNext/>
-              <w:spacing w:after="0" w:before="0" w:line="264" w:lineRule="auto"/>
-            </w:pPr>
-            <w:r>
-              <w:rPr>
-                <w:b w:val="0"/>
-                <w:i w:val="0"/>
-                <w:sz w:val="24"/>
-              </w:rPr>
-              <w:t>Point.</w:t>
-            </w:r>
-          </w:p>
-        </w:tc>
-        <w:tc>
-          <w:tcPr>
-            <w:tcW w:type="dxa" w:w="3562"/>
-            <w:vAlign w:val="center"/>
-          </w:tcPr>
-          <w:p>
-            <w:pPr>
-              <w:keepNext/>
-              <w:spacing w:after="0" w:before="0" w:line="264" w:lineRule="auto"/>
-            </w:pPr>
-            <w:r>
-              <w:rPr>
-                <w:b w:val="0"/>
-                <w:i w:val="0"/>
-                <w:sz w:val="24"/>
-              </w:rPr>
-              <w:t>Señala.</w:t>
-            </w:r>
-          </w:p>
-        </w:tc>
-        <w:tc>
-          <w:tcPr>
-            <w:tcW w:type="dxa" w:w="1564"/>
-            <w:vAlign w:val="center"/>
-          </w:tcPr>
-          <w:p>
-            <w:pPr>
-              <w:keepNext/>
-              <w:spacing w:after="0" w:before="0" w:line="264" w:lineRule="auto"/>
-            </w:pPr>
-            <w:r>
-              <w:br/>
-            </w:r>
-          </w:p>
-        </w:tc>
-      </w:tr>
-      <w:tr>
-        <w:trPr>
-          <w:cantSplit/>
-        </w:trPr>
-        <w:tc>
-          <w:tcPr>
-            <w:tcW w:type="dxa" w:w="1564"/>
-            <w:vAlign w:val="center"/>
-            <w:shd w:val="clear" w:color="auto" w:fill="EEF4F7"/>
-          </w:tcPr>
-          <w:p>
-            <w:pPr>
-              <w:keepNext/>
-              <w:spacing w:after="0" w:before="0" w:line="264" w:lineRule="auto"/>
-            </w:pPr>
-            <w:r>
-              <w:rPr>
-                <w:b w:val="0"/>
-                <w:i w:val="0"/>
-                <w:sz w:val="24"/>
-              </w:rPr>
-              <w:t>🔗</w:t>
-            </w:r>
-          </w:p>
-        </w:tc>
-        <w:tc>
-          <w:tcPr>
-            <w:tcW w:type="dxa" w:w="2958"/>
-            <w:vAlign w:val="center"/>
-            <w:shd w:val="clear" w:color="auto" w:fill="EEF4F7"/>
-          </w:tcPr>
-          <w:p>
-            <w:pPr>
-              <w:keepNext/>
-              <w:spacing w:after="0" w:before="0" w:line="264" w:lineRule="auto"/>
-            </w:pPr>
-            <w:r>
-              <w:rPr>
-                <w:b w:val="0"/>
-                <w:i w:val="0"/>
-                <w:sz w:val="24"/>
-              </w:rPr>
-              <w:t>Match. Draw a line.</w:t>
-            </w:r>
-          </w:p>
-        </w:tc>
-        <w:tc>
-          <w:tcPr>
-            <w:tcW w:type="dxa" w:w="3562"/>
-            <w:vAlign w:val="center"/>
-            <w:shd w:val="clear" w:color="auto" w:fill="EEF4F7"/>
-          </w:tcPr>
-          <w:p>
-            <w:pPr>
-              <w:keepNext/>
-              <w:spacing w:after="0" w:before="0" w:line="264" w:lineRule="auto"/>
-            </w:pPr>
-            <w:r>
-              <w:rPr>
-                <w:b w:val="0"/>
-                <w:i w:val="0"/>
-                <w:sz w:val="24"/>
-              </w:rPr>
-              <w:t>Une. Dibuja una línea.</w:t>
-            </w:r>
-          </w:p>
-        </w:tc>
-        <w:tc>
-          <w:tcPr>
-            <w:tcW w:type="dxa" w:w="1564"/>
-            <w:vAlign w:val="center"/>
-            <w:shd w:val="clear" w:color="auto" w:fill="EEF4F7"/>
-          </w:tcPr>
-          <w:p>
-            <w:pPr>
-              <w:keepNext/>
-              <w:spacing w:after="0" w:before="0" w:line="264" w:lineRule="auto"/>
-            </w:pPr>
-            <w:r>
-              <w:br/>
-            </w:r>
-          </w:p>
-        </w:tc>
-      </w:tr>
-      <w:tr>
-        <w:trPr>
-          <w:cantSplit/>
-        </w:trPr>
-        <w:tc>
-          <w:tcPr>
-            <w:tcW w:type="dxa" w:w="1564"/>
-            <w:vAlign w:val="center"/>
-          </w:tcPr>
-          <w:p>
-            <w:pPr>
-              <w:keepNext/>
-              <w:spacing w:after="0" w:before="0" w:line="264" w:lineRule="auto"/>
-            </w:pPr>
-            <w:r>
-              <w:rPr>
-                <w:b w:val="0"/>
-                <w:i w:val="0"/>
-                <w:sz w:val="24"/>
-              </w:rPr>
-              <w:t>👥</w:t>
-            </w:r>
-          </w:p>
-        </w:tc>
-        <w:tc>
-          <w:tcPr>
-            <w:tcW w:type="dxa" w:w="2958"/>
-            <w:vAlign w:val="center"/>
-          </w:tcPr>
-          <w:p>
-            <w:pPr>
-              <w:keepNext/>
-              <w:spacing w:after="0" w:before="0" w:line="264" w:lineRule="auto"/>
-            </w:pPr>
-            <w:r>
-              <w:rPr>
-                <w:b w:val="0"/>
-                <w:i w:val="0"/>
-                <w:sz w:val="24"/>
-              </w:rPr>
-              <w:t>Work with a partner.</w:t>
-            </w:r>
-          </w:p>
-        </w:tc>
-        <w:tc>
-          <w:tcPr>
-            <w:tcW w:type="dxa" w:w="3562"/>
-            <w:vAlign w:val="center"/>
-          </w:tcPr>
-          <w:p>
-            <w:pPr>
-              <w:keepNext/>
-              <w:spacing w:after="0" w:before="0" w:line="264" w:lineRule="auto"/>
-            </w:pPr>
-            <w:r>
-              <w:rPr>
-                <w:b w:val="0"/>
-                <w:i w:val="0"/>
-                <w:sz w:val="24"/>
-              </w:rPr>
-              <w:t>Trabaja con un compañero.</w:t>
-            </w:r>
-          </w:p>
-        </w:tc>
-        <w:tc>
-          <w:tcPr>
-            <w:tcW w:type="dxa" w:w="1564"/>
-            <w:vAlign w:val="center"/>
-          </w:tcPr>
-          <w:p>
-            <w:pPr>
-              <w:keepNext/>
-              <w:spacing w:after="0" w:before="0" w:line="264" w:lineRule="auto"/>
-            </w:pPr>
-            <w:r>
-              <w:br/>
-            </w:r>
-          </w:p>
-        </w:tc>
-      </w:tr>
-      <w:tr>
-        <w:trPr>
-          <w:cantSplit/>
-        </w:trPr>
-        <w:tc>
-          <w:tcPr>
-            <w:tcW w:type="dxa" w:w="1564"/>
-            <w:vAlign w:val="center"/>
-            <w:shd w:val="clear" w:color="auto" w:fill="EEF4F7"/>
-          </w:tcPr>
-          <w:p>
-            <w:pPr>
-              <w:keepNext/>
-              <w:spacing w:after="0" w:before="0" w:line="264" w:lineRule="auto"/>
-            </w:pPr>
-            <w:r>
-              <w:rPr>
-                <w:b w:val="0"/>
-                <w:i w:val="0"/>
-                <w:sz w:val="24"/>
-              </w:rPr>
-              <w:t>👨‍👩‍👧</w:t>
-            </w:r>
-          </w:p>
-        </w:tc>
-        <w:tc>
-          <w:tcPr>
-            <w:tcW w:type="dxa" w:w="2958"/>
-            <w:vAlign w:val="center"/>
-            <w:shd w:val="clear" w:color="auto" w:fill="EEF4F7"/>
-          </w:tcPr>
-          <w:p>
-            <w:pPr>
-              <w:keepNext/>
-              <w:spacing w:after="0" w:before="0" w:line="264" w:lineRule="auto"/>
-            </w:pPr>
-            <w:r>
-              <w:rPr>
-                <w:b w:val="0"/>
-                <w:i w:val="0"/>
-                <w:sz w:val="24"/>
-              </w:rPr>
-              <w:t>Work in a group.</w:t>
-            </w:r>
-          </w:p>
-        </w:tc>
-        <w:tc>
-          <w:tcPr>
-            <w:tcW w:type="dxa" w:w="3562"/>
-            <w:vAlign w:val="center"/>
-            <w:shd w:val="clear" w:color="auto" w:fill="EEF4F7"/>
-          </w:tcPr>
-          <w:p>
-            <w:pPr>
-              <w:keepNext/>
-              <w:spacing w:after="0" w:before="0" w:line="264" w:lineRule="auto"/>
-            </w:pPr>
-            <w:r>
-              <w:rPr>
-                <w:b w:val="0"/>
-                <w:i w:val="0"/>
-                <w:sz w:val="24"/>
-              </w:rPr>
-              <w:t>Trabaja en grupo.</w:t>
-            </w:r>
-          </w:p>
-        </w:tc>
-        <w:tc>
-          <w:tcPr>
-            <w:tcW w:type="dxa" w:w="1564"/>
-            <w:vAlign w:val="center"/>
-            <w:shd w:val="clear" w:color="auto" w:fill="EEF4F7"/>
-          </w:tcPr>
-          <w:p>
-            <w:pPr>
-              <w:keepNext/>
-              <w:spacing w:after="0" w:before="0" w:line="264" w:lineRule="auto"/>
-            </w:pPr>
-            <w:r>
-              <w:br/>
-            </w:r>
-          </w:p>
-        </w:tc>
-      </w:tr>
-      <w:tr>
-        <w:trPr>
-          <w:cantSplit/>
-        </w:trPr>
-        <w:tc>
-          <w:tcPr>
-            <w:tcW w:type="dxa" w:w="1564"/>
-            <w:vAlign w:val="center"/>
-          </w:tcPr>
-          <w:p>
-            <w:pPr>
-              <w:keepNext/>
-              <w:spacing w:after="0" w:before="0" w:line="264" w:lineRule="auto"/>
-            </w:pPr>
-            <w:r>
-              <w:rPr>
-                <w:b w:val="0"/>
-                <w:i w:val="0"/>
-                <w:sz w:val="24"/>
-              </w:rPr>
-              <w:t>🚶</w:t>
-            </w:r>
-          </w:p>
-        </w:tc>
-        <w:tc>
-          <w:tcPr>
-            <w:tcW w:type="dxa" w:w="2958"/>
-            <w:vAlign w:val="center"/>
-          </w:tcPr>
-          <w:p>
-            <w:pPr>
-              <w:keepNext/>
-              <w:spacing w:after="0" w:before="0" w:line="264" w:lineRule="auto"/>
-            </w:pPr>
-            <w:r>
-              <w:rPr>
-                <w:b w:val="0"/>
-                <w:i w:val="0"/>
-                <w:sz w:val="24"/>
-              </w:rPr>
-              <w:t>Walk and talk to classmates.</w:t>
-            </w:r>
-          </w:p>
-        </w:tc>
-        <w:tc>
-          <w:tcPr>
-            <w:tcW w:type="dxa" w:w="3562"/>
-            <w:vAlign w:val="center"/>
-          </w:tcPr>
-          <w:p>
-            <w:pPr>
-              <w:keepNext/>
-              <w:spacing w:after="0" w:before="0" w:line="264" w:lineRule="auto"/>
-            </w:pPr>
-            <w:r>
-              <w:rPr>
-                <w:b w:val="0"/>
-                <w:i w:val="0"/>
-                <w:sz w:val="24"/>
-              </w:rPr>
-              <w:t>Camina y habla con tus compañeros.</w:t>
-            </w:r>
-          </w:p>
-        </w:tc>
-        <w:tc>
-          <w:tcPr>
-            <w:tcW w:type="dxa" w:w="1564"/>
-            <w:vAlign w:val="center"/>
-          </w:tcPr>
-          <w:p>
-            <w:pPr>
-              <w:keepNext/>
-              <w:spacing w:after="0" w:before="0" w:line="264" w:lineRule="auto"/>
-            </w:pPr>
-            <w:r>
-              <w:br/>
-            </w:r>
-          </w:p>
-        </w:tc>
-      </w:tr>
-      <w:tr>
-        <w:trPr>
-          <w:cantSplit/>
-        </w:trPr>
-        <w:tc>
-          <w:tcPr>
-            <w:tcW w:type="dxa" w:w="1564"/>
-            <w:vAlign w:val="center"/>
-            <w:shd w:val="clear" w:color="auto" w:fill="EEF4F7"/>
-          </w:tcPr>
-          <w:p>
-            <w:pPr>
-              <w:keepNext/>
-              <w:spacing w:after="0" w:before="0" w:line="264" w:lineRule="auto"/>
-            </w:pPr>
-            <w:r>
-              <w:rPr>
-                <w:b w:val="0"/>
-                <w:i w:val="0"/>
-                <w:sz w:val="24"/>
-              </w:rPr>
-              <w:t>🏠</w:t>
-            </w:r>
-          </w:p>
-        </w:tc>
-        <w:tc>
-          <w:tcPr>
-            <w:tcW w:type="dxa" w:w="2958"/>
-            <w:vAlign w:val="center"/>
-            <w:shd w:val="clear" w:color="auto" w:fill="EEF4F7"/>
-          </w:tcPr>
-          <w:p>
-            <w:pPr>
-              <w:keepNext/>
-              <w:spacing w:after="0" w:before="0" w:line="264" w:lineRule="auto"/>
-            </w:pPr>
-            <w:r>
-              <w:rPr>
-                <w:b w:val="0"/>
-                <w:i w:val="0"/>
-                <w:sz w:val="24"/>
-              </w:rPr>
-              <w:t>Homework. Do it at home.</w:t>
-            </w:r>
-          </w:p>
-        </w:tc>
-        <w:tc>
-          <w:tcPr>
-            <w:tcW w:type="dxa" w:w="3562"/>
-            <w:vAlign w:val="center"/>
-            <w:shd w:val="clear" w:color="auto" w:fill="EEF4F7"/>
-          </w:tcPr>
-          <w:p>
-            <w:pPr>
-              <w:keepNext/>
-              <w:spacing w:after="0" w:before="0" w:line="264" w:lineRule="auto"/>
-            </w:pPr>
-            <w:r>
-              <w:rPr>
-                <w:b w:val="0"/>
-                <w:i w:val="0"/>
-                <w:sz w:val="24"/>
-              </w:rPr>
-              <w:t>Tarea. Hazla en casa.</w:t>
-            </w:r>
-          </w:p>
-        </w:tc>
-        <w:tc>
-          <w:tcPr>
-            <w:tcW w:type="dxa" w:w="1564"/>
-            <w:vAlign w:val="center"/>
-            <w:shd w:val="clear" w:color="auto" w:fill="EEF4F7"/>
-          </w:tcPr>
-          <w:p>
-            <w:pPr>
-              <w:keepNext/>
-              <w:spacing w:after="0" w:before="0" w:line="264" w:lineRule="auto"/>
-            </w:pPr>
-            <w:r>
-              <w:br/>
-            </w:r>
-          </w:p>
-        </w:tc>
-      </w:tr>
-      <w:tr>
-        <w:trPr>
-          <w:cantSplit/>
-        </w:trPr>
-        <w:tc>
-          <w:tcPr>
-            <w:tcW w:type="dxa" w:w="1564"/>
-            <w:vAlign w:val="center"/>
-          </w:tcPr>
-          <w:p>
-            <w:pPr>
-              <w:spacing w:after="0" w:before="0" w:line="264" w:lineRule="auto"/>
-            </w:pPr>
-            <w:r>
-              <w:rPr>
-                <w:rFonts w:ascii="DejaVu Sans" w:hAnsi="DejaVu Sans" w:cs="DejaVu Sans" w:eastAsia="DejaVu Sans"/>
-                <w:b w:val="0"/>
-                <w:color w:val="C07A00"/>
-                <w:sz w:val="24"/>
-              </w:rPr>
-              <w:t>★</w:t>
-            </w:r>
-          </w:p>
-        </w:tc>
-        <w:tc>
-          <w:tcPr>
-            <w:tcW w:type="dxa" w:w="2958"/>
-            <w:vAlign w:val="center"/>
-          </w:tcPr>
-          <w:p>
-            <w:pPr>
-              <w:spacing w:after="0" w:before="0" w:line="264" w:lineRule="auto"/>
-            </w:pPr>
-            <w:r>
-              <w:rPr>
-                <w:b w:val="0"/>
-                <w:i w:val="0"/>
-                <w:sz w:val="24"/>
-              </w:rPr>
-              <w:t>Important word.</w:t>
-            </w:r>
-          </w:p>
-        </w:tc>
-        <w:tc>
-          <w:tcPr>
-            <w:tcW w:type="dxa" w:w="3562"/>
-            <w:vAlign w:val="center"/>
-          </w:tcPr>
-          <w:p>
-            <w:pPr>
-              <w:spacing w:after="0" w:before="0" w:line="264" w:lineRule="auto"/>
-            </w:pPr>
-            <w:r>
-              <w:rPr>
-                <w:b w:val="0"/>
-                <w:i w:val="0"/>
-                <w:sz w:val="24"/>
-              </w:rPr>
-              <w:t>Palabra importante.</w:t>
-            </w:r>
-          </w:p>
-        </w:tc>
-        <w:tc>
-          <w:tcPr>
-            <w:tcW w:type="dxa" w:w="1564"/>
-            <w:vAlign w:val="center"/>
-          </w:tcPr>
-          <w:p>
-            <w:pPr>
-              <w:spacing w:after="0" w:before="0" w:line="264" w:lineRule="auto"/>
-            </w:pPr>
-            <w:r>
-              <w:br/>
-            </w:r>
-          </w:p>
-        </w:tc>
-      </w:tr>
-    </w:tbl>
-    <w:p>
-      <w:pPr>
-        <w:spacing w:after="200" w:before="0" w:line="240" w:lineRule="auto"/>
-      </w:pPr>
-      <w:r>
-        <w:rPr>
-          <w:sz w:val="8"/>
-        </w:rPr>
-      </w:r>
-    </w:p>
-    <w:p>
-      <w:pPr>
-        <w:keepNext/>
-        <w:pageBreakBefore/>
         <w:spacing w:after="200" w:before="0" w:line="252" w:lineRule="auto"/>
         <w:pBdr>
           <w:bottom w:val="single" w:sz="10" w:space="4" w:color="1B6F7A"/>
@@ -10951,7 +9634,7 @@
           <w:color w:val="1B6F7A"/>
           <w:sz w:val="34"/>
         </w:rPr>
-        <w:t>🕕 Our class</w:t>
+        <w:t>Our class</w:t>
       </w:r>
     </w:p>
     <w:tbl>
@@ -11062,7 +9745,7 @@
                 <w:i w:val="0"/>
                 <w:sz w:val="24"/>
               </w:rPr>
-              <w:t>📖 Class</w:t>
+              <w:t>Class</w:t>
             </w:r>
           </w:p>
         </w:tc>
@@ -11109,7 +9792,7 @@
                 <w:i w:val="0"/>
                 <w:sz w:val="24"/>
               </w:rPr>
-              <w:t>☕ Break</w:t>
+              <w:t>Break</w:t>
             </w:r>
           </w:p>
         </w:tc>
@@ -11154,7 +9837,7 @@
                 <w:i w:val="0"/>
                 <w:sz w:val="24"/>
               </w:rPr>
-              <w:t>👥 Class: talk with classmates</w:t>
+              <w:t>Class: talk with classmates</w:t>
             </w:r>
           </w:p>
         </w:tc>
@@ -11199,7 +9882,7 @@
                 <w:i w:val="0"/>
                 <w:sz w:val="24"/>
               </w:rPr>
-              <w:t>🔤 Letters &amp; Numbers</w:t>
+              <w:t>Letters &amp; Numbers</w:t>
             </w:r>
           </w:p>
         </w:tc>
@@ -11227,14 +9910,6 @@
           <w:sz w:val="26"/>
         </w:rPr>
         <w:t xml:space="preserve">•  </w:t>
-      </w:r>
-      <w:r>
-        <w:rPr>
-          <w:b w:val="0"/>
-          <w:i w:val="0"/>
-          <w:sz w:val="26"/>
-        </w:rPr>
-        <w:t xml:space="preserve">🗣️ </w:t>
       </w:r>
       <w:r>
         <w:rPr>
@@ -11268,14 +9943,6 @@
       </w:r>
       <w:r>
         <w:rPr>
-          <w:b w:val="0"/>
-          <w:i w:val="0"/>
-          <w:sz w:val="26"/>
-        </w:rPr>
-        <w:t xml:space="preserve">🏠 </w:t>
-      </w:r>
-      <w:r>
-        <w:rPr>
           <w:b/>
           <w:i w:val="0"/>
           <w:sz w:val="26"/>
@@ -11303,14 +9970,6 @@
           <w:sz w:val="26"/>
         </w:rPr>
         <w:t xml:space="preserve">•  </w:t>
-      </w:r>
-      <w:r>
-        <w:rPr>
-          <w:b w:val="0"/>
-          <w:i w:val="0"/>
-          <w:sz w:val="26"/>
-        </w:rPr>
-        <w:t xml:space="preserve">📱 </w:t>
       </w:r>
       <w:r>
         <w:rPr>
@@ -11401,7 +10060,7 @@
                 <w:i w:val="0"/>
                 <w:sz w:val="25"/>
               </w:rPr>
-              <w:t xml:space="preserve"> Cada tarea tiene un ícono, una línea en español y una línea "My language" para escribir en tu idioma. ¡Pero en clase, habla inglés!</w:t>
+              <w:t xml:space="preserve"> Cada tarea tiene una línea en español y una línea "My language" para escribir en tu idioma. ¡Pero en clase, habla inglés!</w:t>
             </w:r>
           </w:p>
         </w:tc>
@@ -11543,14 +10202,6 @@
       <w:pPr>
         <w:spacing w:after="180" w:before="0" w:line="300" w:lineRule="auto"/>
       </w:pPr>
-      <w:r>
-        <w:rPr>
-          <w:b w:val="0"/>
-          <w:i w:val="0"/>
-          <w:sz w:val="26"/>
-        </w:rPr>
-        <w:t xml:space="preserve">👂 🗣️ </w:t>
-      </w:r>
       <w:r>
         <w:rPr>
           <w:b/>
@@ -12548,7 +11199,7 @@
           <w:color w:val="1B6F7A"/>
           <w:sz w:val="34"/>
         </w:rPr>
-        <w:t>👥 ☝️ 🗣️ Partner game: A points. B says the word.</w:t>
+        <w:t>Partner game: A points. B says the word.</w:t>
       </w:r>
     </w:p>
     <w:p>
@@ -12602,14 +11253,6 @@
       </w:pPr>
       <w:r>
         <w:rPr>
-          <w:b w:val="0"/>
-          <w:i w:val="0"/>
-          <w:sz w:val="26"/>
-        </w:rPr>
-        <w:t xml:space="preserve">👂 🗣️ </w:t>
-      </w:r>
-      <w:r>
-        <w:rPr>
           <w:b/>
           <w:i w:val="0"/>
           <w:sz w:val="26"/>
@@ -12658,10 +11301,9 @@
         </w:tblCellMar>
       </w:tblPr>
       <w:tblGrid>
-        <w:gridCol w:w="1612"/>
-        <w:gridCol w:w="3289"/>
-        <w:gridCol w:w="3133"/>
-        <w:gridCol w:w="1612"/>
+        <w:gridCol w:w="3949"/>
+        <w:gridCol w:w="3761"/>
+        <w:gridCol w:w="1936"/>
       </w:tblGrid>
       <w:tr>
         <w:trPr>
@@ -12670,7 +11312,7 @@
         </w:trPr>
         <w:tc>
           <w:tcPr>
-            <w:tcW w:type="dxa" w:w="1613"/>
+            <w:tcW w:type="dxa" w:w="3950"/>
             <w:vAlign w:val="center"/>
             <w:shd w:val="clear" w:color="auto" w:fill="1F3A5F"/>
           </w:tcPr>
@@ -12679,11 +11321,20 @@
               <w:keepNext/>
               <w:spacing w:after="0" w:before="0" w:line="264" w:lineRule="auto"/>
             </w:pPr>
-          </w:p>
-        </w:tc>
-        <w:tc>
-          <w:tcPr>
-            <w:tcW w:type="dxa" w:w="3290"/>
+            <w:r>
+              <w:rPr>
+                <w:b/>
+                <w:i w:val="0"/>
+                <w:color w:val="FFFFFF"/>
+                <w:sz w:val="24"/>
+              </w:rPr>
+              <w:t>Phrase</w:t>
+            </w:r>
+          </w:p>
+        </w:tc>
+        <w:tc>
+          <w:tcPr>
+            <w:tcW w:type="dxa" w:w="3762"/>
             <w:vAlign w:val="center"/>
             <w:shd w:val="clear" w:color="auto" w:fill="1F3A5F"/>
           </w:tcPr>
@@ -12699,35 +11350,13 @@
                 <w:color w:val="FFFFFF"/>
                 <w:sz w:val="24"/>
               </w:rPr>
-              <w:t>Phrase</w:t>
-            </w:r>
-          </w:p>
-        </w:tc>
-        <w:tc>
-          <w:tcPr>
-            <w:tcW w:type="dxa" w:w="3133"/>
-            <w:vAlign w:val="center"/>
-            <w:shd w:val="clear" w:color="auto" w:fill="1F3A5F"/>
-          </w:tcPr>
-          <w:p>
-            <w:pPr>
-              <w:keepNext/>
-              <w:spacing w:after="0" w:before="0" w:line="264" w:lineRule="auto"/>
-            </w:pPr>
-            <w:r>
-              <w:rPr>
-                <w:b/>
-                <w:i w:val="0"/>
-                <w:color w:val="FFFFFF"/>
-                <w:sz w:val="24"/>
-              </w:rPr>
               <w:t>Español</w:t>
             </w:r>
           </w:p>
         </w:tc>
         <w:tc>
           <w:tcPr>
-            <w:tcW w:type="dxa" w:w="1613"/>
+            <w:tcW w:type="dxa" w:w="1936"/>
             <w:vAlign w:val="center"/>
             <w:shd w:val="clear" w:color="auto" w:fill="1F3A5F"/>
           </w:tcPr>
@@ -12754,7 +11383,7 @@
         </w:trPr>
         <w:tc>
           <w:tcPr>
-            <w:tcW w:type="dxa" w:w="1613"/>
+            <w:tcW w:type="dxa" w:w="3950"/>
             <w:vAlign w:val="center"/>
           </w:tcPr>
           <w:p>
@@ -12764,17 +11393,17 @@
             </w:pPr>
             <w:r>
               <w:rPr>
-                <w:b w:val="0"/>
+                <w:b/>
                 <w:i w:val="0"/>
                 <w:sz w:val="24"/>
               </w:rPr>
-              <w:t>👂</w:t>
-            </w:r>
-          </w:p>
-        </w:tc>
-        <w:tc>
-          <w:tcPr>
-            <w:tcW w:type="dxa" w:w="3290"/>
+              <w:t>Listen.</w:t>
+            </w:r>
+          </w:p>
+        </w:tc>
+        <w:tc>
+          <w:tcPr>
+            <w:tcW w:type="dxa" w:w="3762"/>
             <w:vAlign w:val="center"/>
           </w:tcPr>
           <w:p>
@@ -12784,37 +11413,17 @@
             </w:pPr>
             <w:r>
               <w:rPr>
-                <w:b/>
+                <w:b w:val="0"/>
                 <w:i w:val="0"/>
                 <w:sz w:val="24"/>
               </w:rPr>
-              <w:t>Listen.</w:t>
-            </w:r>
-          </w:p>
-        </w:tc>
-        <w:tc>
-          <w:tcPr>
-            <w:tcW w:type="dxa" w:w="3133"/>
-            <w:vAlign w:val="center"/>
-          </w:tcPr>
-          <w:p>
-            <w:pPr>
-              <w:keepNext/>
-              <w:spacing w:after="0" w:before="0" w:line="264" w:lineRule="auto"/>
-            </w:pPr>
-            <w:r>
-              <w:rPr>
-                <w:b w:val="0"/>
-                <w:i w:val="0"/>
-                <w:sz w:val="24"/>
-              </w:rPr>
               <w:t>Escucha.</w:t>
             </w:r>
           </w:p>
         </w:tc>
         <w:tc>
           <w:tcPr>
-            <w:tcW w:type="dxa" w:w="1613"/>
+            <w:tcW w:type="dxa" w:w="1936"/>
             <w:vAlign w:val="center"/>
           </w:tcPr>
           <w:p>
@@ -12834,7 +11443,7 @@
         </w:trPr>
         <w:tc>
           <w:tcPr>
-            <w:tcW w:type="dxa" w:w="1613"/>
+            <w:tcW w:type="dxa" w:w="3950"/>
             <w:vAlign w:val="center"/>
             <w:shd w:val="clear" w:color="auto" w:fill="EEF4F7"/>
           </w:tcPr>
@@ -12845,17 +11454,17 @@
             </w:pPr>
             <w:r>
               <w:rPr>
-                <w:b w:val="0"/>
+                <w:b/>
                 <w:i w:val="0"/>
                 <w:sz w:val="24"/>
               </w:rPr>
-              <w:t>🗣️</w:t>
-            </w:r>
-          </w:p>
-        </w:tc>
-        <w:tc>
-          <w:tcPr>
-            <w:tcW w:type="dxa" w:w="3290"/>
+              <w:t>Repeat.</w:t>
+            </w:r>
+          </w:p>
+        </w:tc>
+        <w:tc>
+          <w:tcPr>
+            <w:tcW w:type="dxa" w:w="3762"/>
             <w:vAlign w:val="center"/>
             <w:shd w:val="clear" w:color="auto" w:fill="EEF4F7"/>
           </w:tcPr>
@@ -12866,38 +11475,17 @@
             </w:pPr>
             <w:r>
               <w:rPr>
-                <w:b/>
+                <w:b w:val="0"/>
                 <w:i w:val="0"/>
                 <w:sz w:val="24"/>
               </w:rPr>
-              <w:t>Repeat.</w:t>
-            </w:r>
-          </w:p>
-        </w:tc>
-        <w:tc>
-          <w:tcPr>
-            <w:tcW w:type="dxa" w:w="3133"/>
-            <w:vAlign w:val="center"/>
-            <w:shd w:val="clear" w:color="auto" w:fill="EEF4F7"/>
-          </w:tcPr>
-          <w:p>
-            <w:pPr>
-              <w:keepNext/>
-              <w:spacing w:after="0" w:before="0" w:line="264" w:lineRule="auto"/>
-            </w:pPr>
-            <w:r>
-              <w:rPr>
-                <w:b w:val="0"/>
-                <w:i w:val="0"/>
-                <w:sz w:val="24"/>
-              </w:rPr>
               <w:t>Repite.</w:t>
             </w:r>
           </w:p>
         </w:tc>
         <w:tc>
           <w:tcPr>
-            <w:tcW w:type="dxa" w:w="1613"/>
+            <w:tcW w:type="dxa" w:w="1936"/>
             <w:vAlign w:val="center"/>
             <w:shd w:val="clear" w:color="auto" w:fill="EEF4F7"/>
           </w:tcPr>
@@ -12918,7 +11506,7 @@
         </w:trPr>
         <w:tc>
           <w:tcPr>
-            <w:tcW w:type="dxa" w:w="1613"/>
+            <w:tcW w:type="dxa" w:w="3950"/>
             <w:vAlign w:val="center"/>
           </w:tcPr>
           <w:p>
@@ -12928,17 +11516,17 @@
             </w:pPr>
             <w:r>
               <w:rPr>
-                <w:b w:val="0"/>
+                <w:b/>
                 <w:i w:val="0"/>
                 <w:sz w:val="24"/>
               </w:rPr>
-              <w:t>✏️</w:t>
-            </w:r>
-          </w:p>
-        </w:tc>
-        <w:tc>
-          <w:tcPr>
-            <w:tcW w:type="dxa" w:w="3290"/>
+              <w:t>Write.</w:t>
+            </w:r>
+          </w:p>
+        </w:tc>
+        <w:tc>
+          <w:tcPr>
+            <w:tcW w:type="dxa" w:w="3762"/>
             <w:vAlign w:val="center"/>
           </w:tcPr>
           <w:p>
@@ -12948,37 +11536,17 @@
             </w:pPr>
             <w:r>
               <w:rPr>
-                <w:b/>
+                <w:b w:val="0"/>
                 <w:i w:val="0"/>
                 <w:sz w:val="24"/>
               </w:rPr>
-              <w:t>Write.</w:t>
-            </w:r>
-          </w:p>
-        </w:tc>
-        <w:tc>
-          <w:tcPr>
-            <w:tcW w:type="dxa" w:w="3133"/>
-            <w:vAlign w:val="center"/>
-          </w:tcPr>
-          <w:p>
-            <w:pPr>
-              <w:keepNext/>
-              <w:spacing w:after="0" w:before="0" w:line="264" w:lineRule="auto"/>
-            </w:pPr>
-            <w:r>
-              <w:rPr>
-                <w:b w:val="0"/>
-                <w:i w:val="0"/>
-                <w:sz w:val="24"/>
-              </w:rPr>
               <w:t>Escribe.</w:t>
             </w:r>
           </w:p>
         </w:tc>
         <w:tc>
           <w:tcPr>
-            <w:tcW w:type="dxa" w:w="1613"/>
+            <w:tcW w:type="dxa" w:w="1936"/>
             <w:vAlign w:val="center"/>
           </w:tcPr>
           <w:p>
@@ -12998,7 +11566,7 @@
         </w:trPr>
         <w:tc>
           <w:tcPr>
-            <w:tcW w:type="dxa" w:w="1613"/>
+            <w:tcW w:type="dxa" w:w="3950"/>
             <w:vAlign w:val="center"/>
             <w:shd w:val="clear" w:color="auto" w:fill="EEF4F7"/>
           </w:tcPr>
@@ -13009,17 +11577,17 @@
             </w:pPr>
             <w:r>
               <w:rPr>
-                <w:b w:val="0"/>
+                <w:b/>
                 <w:i w:val="0"/>
                 <w:sz w:val="24"/>
               </w:rPr>
-              <w:t>🔁</w:t>
-            </w:r>
-          </w:p>
-        </w:tc>
-        <w:tc>
-          <w:tcPr>
-            <w:tcW w:type="dxa" w:w="3290"/>
+              <w:t>Can you repeat, please?</w:t>
+            </w:r>
+          </w:p>
+        </w:tc>
+        <w:tc>
+          <w:tcPr>
+            <w:tcW w:type="dxa" w:w="3762"/>
             <w:vAlign w:val="center"/>
             <w:shd w:val="clear" w:color="auto" w:fill="EEF4F7"/>
           </w:tcPr>
@@ -13030,38 +11598,17 @@
             </w:pPr>
             <w:r>
               <w:rPr>
-                <w:b/>
+                <w:b w:val="0"/>
                 <w:i w:val="0"/>
                 <w:sz w:val="24"/>
               </w:rPr>
-              <w:t>Can you repeat, please?</w:t>
-            </w:r>
-          </w:p>
-        </w:tc>
-        <w:tc>
-          <w:tcPr>
-            <w:tcW w:type="dxa" w:w="3133"/>
-            <w:vAlign w:val="center"/>
-            <w:shd w:val="clear" w:color="auto" w:fill="EEF4F7"/>
-          </w:tcPr>
-          <w:p>
-            <w:pPr>
-              <w:keepNext/>
-              <w:spacing w:after="0" w:before="0" w:line="264" w:lineRule="auto"/>
-            </w:pPr>
-            <w:r>
-              <w:rPr>
-                <w:b w:val="0"/>
-                <w:i w:val="0"/>
-                <w:sz w:val="24"/>
-              </w:rPr>
               <w:t>¿Puede repetir, por favor?</w:t>
             </w:r>
           </w:p>
         </w:tc>
         <w:tc>
           <w:tcPr>
-            <w:tcW w:type="dxa" w:w="1613"/>
+            <w:tcW w:type="dxa" w:w="1936"/>
             <w:vAlign w:val="center"/>
             <w:shd w:val="clear" w:color="auto" w:fill="EEF4F7"/>
           </w:tcPr>
@@ -13082,7 +11629,7 @@
         </w:trPr>
         <w:tc>
           <w:tcPr>
-            <w:tcW w:type="dxa" w:w="1613"/>
+            <w:tcW w:type="dxa" w:w="3950"/>
             <w:vAlign w:val="center"/>
           </w:tcPr>
           <w:p>
@@ -13092,17 +11639,17 @@
             </w:pPr>
             <w:r>
               <w:rPr>
-                <w:b w:val="0"/>
+                <w:b/>
                 <w:i w:val="0"/>
                 <w:sz w:val="24"/>
               </w:rPr>
-              <w:t>🤷</w:t>
-            </w:r>
-          </w:p>
-        </w:tc>
-        <w:tc>
-          <w:tcPr>
-            <w:tcW w:type="dxa" w:w="3290"/>
+              <w:t>I don't understand.</w:t>
+            </w:r>
+          </w:p>
+        </w:tc>
+        <w:tc>
+          <w:tcPr>
+            <w:tcW w:type="dxa" w:w="3762"/>
             <w:vAlign w:val="center"/>
           </w:tcPr>
           <w:p>
@@ -13112,37 +11659,17 @@
             </w:pPr>
             <w:r>
               <w:rPr>
-                <w:b/>
+                <w:b w:val="0"/>
                 <w:i w:val="0"/>
                 <w:sz w:val="24"/>
               </w:rPr>
-              <w:t>I don't understand.</w:t>
-            </w:r>
-          </w:p>
-        </w:tc>
-        <w:tc>
-          <w:tcPr>
-            <w:tcW w:type="dxa" w:w="3133"/>
-            <w:vAlign w:val="center"/>
-          </w:tcPr>
-          <w:p>
-            <w:pPr>
-              <w:keepNext/>
-              <w:spacing w:after="0" w:before="0" w:line="264" w:lineRule="auto"/>
-            </w:pPr>
-            <w:r>
-              <w:rPr>
-                <w:b w:val="0"/>
-                <w:i w:val="0"/>
-                <w:sz w:val="24"/>
-              </w:rPr>
               <w:t>No entiendo.</w:t>
             </w:r>
           </w:p>
         </w:tc>
         <w:tc>
           <w:tcPr>
-            <w:tcW w:type="dxa" w:w="1613"/>
+            <w:tcW w:type="dxa" w:w="1936"/>
             <w:vAlign w:val="center"/>
           </w:tcPr>
           <w:p>
@@ -13162,7 +11689,7 @@
         </w:trPr>
         <w:tc>
           <w:tcPr>
-            <w:tcW w:type="dxa" w:w="1613"/>
+            <w:tcW w:type="dxa" w:w="3950"/>
             <w:vAlign w:val="center"/>
             <w:shd w:val="clear" w:color="auto" w:fill="EEF4F7"/>
           </w:tcPr>
@@ -13172,17 +11699,17 @@
             </w:pPr>
             <w:r>
               <w:rPr>
-                <w:b w:val="0"/>
+                <w:b/>
                 <w:i w:val="0"/>
                 <w:sz w:val="24"/>
               </w:rPr>
-              <w:t>❓</w:t>
-            </w:r>
-          </w:p>
-        </w:tc>
-        <w:tc>
-          <w:tcPr>
-            <w:tcW w:type="dxa" w:w="3290"/>
+              <w:t>How do you say ___ in English?</w:t>
+            </w:r>
+          </w:p>
+        </w:tc>
+        <w:tc>
+          <w:tcPr>
+            <w:tcW w:type="dxa" w:w="3762"/>
             <w:vAlign w:val="center"/>
             <w:shd w:val="clear" w:color="auto" w:fill="EEF4F7"/>
           </w:tcPr>
@@ -13192,37 +11719,17 @@
             </w:pPr>
             <w:r>
               <w:rPr>
-                <w:b/>
+                <w:b w:val="0"/>
                 <w:i w:val="0"/>
                 <w:sz w:val="24"/>
               </w:rPr>
-              <w:t>How do you say ___ in English?</w:t>
-            </w:r>
-          </w:p>
-        </w:tc>
-        <w:tc>
-          <w:tcPr>
-            <w:tcW w:type="dxa" w:w="3133"/>
-            <w:vAlign w:val="center"/>
-            <w:shd w:val="clear" w:color="auto" w:fill="EEF4F7"/>
-          </w:tcPr>
-          <w:p>
-            <w:pPr>
-              <w:spacing w:after="0" w:before="0" w:line="264" w:lineRule="auto"/>
-            </w:pPr>
-            <w:r>
-              <w:rPr>
-                <w:b w:val="0"/>
-                <w:i w:val="0"/>
-                <w:sz w:val="24"/>
-              </w:rPr>
               <w:t>¿Cómo se dice ___ en inglés?</w:t>
             </w:r>
           </w:p>
         </w:tc>
         <w:tc>
           <w:tcPr>
-            <w:tcW w:type="dxa" w:w="1613"/>
+            <w:tcW w:type="dxa" w:w="1936"/>
             <w:vAlign w:val="center"/>
             <w:shd w:val="clear" w:color="auto" w:fill="EEF4F7"/>
           </w:tcPr>
@@ -13323,7 +11830,7 @@
           <w:color w:val="1B6F7A"/>
           <w:sz w:val="34"/>
         </w:rPr>
-        <w:t>A. 👂 ✅ Listen. Who is it? Check ✓ Ana or Carlos.</w:t>
+        <w:t>A. Listen. Who is it? Check ✓ Ana or Carlos.</w:t>
       </w:r>
     </w:p>
     <w:p>
@@ -13736,7 +12243,7 @@
           <w:color w:val="1B6F7A"/>
           <w:sz w:val="34"/>
         </w:rPr>
-        <w:t>B. 👂 ⭕ Listen again. Circle the letters you hear.</w:t>
+        <w:t>B. Listen again. Circle the letters you hear.</w:t>
       </w:r>
     </w:p>
     <w:p>
@@ -13845,7 +12352,7 @@
           <w:color w:val="1B6F7A"/>
           <w:sz w:val="34"/>
         </w:rPr>
-        <w:t>C. 👂 ✏️ Listen again. Write the last names.</w:t>
+        <w:t>C. Listen again. Write the last names.</w:t>
       </w:r>
     </w:p>
     <w:p>
@@ -13930,7 +12437,7 @@
           <w:color w:val="1B6F7A"/>
           <w:sz w:val="34"/>
         </w:rPr>
-        <w:t xml:space="preserve">🗣️ Say it: </w:t>
+        <w:t xml:space="preserve">Say it: </w:t>
       </w:r>
       <w:r>
         <w:rPr>
@@ -14006,19 +12513,11 @@
       </w:pPr>
       <w:r>
         <w:rPr>
-          <w:b w:val="0"/>
-          <w:i w:val="0"/>
-          <w:sz w:val="26"/>
-        </w:rPr>
-        <w:t xml:space="preserve">👥 🗣️ </w:t>
-      </w:r>
-      <w:r>
-        <w:rPr>
           <w:b/>
           <w:i w:val="0"/>
           <w:sz w:val="26"/>
         </w:rPr>
-        <w:t>Read across. A reads a question (left). B reads an answer (right).</w:t>
+        <w:t>With a partner: read across. A reads a question (left). B reads an answer (right).</w:t>
       </w:r>
       <w:r>
         <w:rPr>
@@ -14039,7 +12538,7 @@
           <w:i/>
           <w:sz w:val="26"/>
         </w:rPr>
-        <w:t>Español: Lee de izquierda a derecha. A lee una pregunta (izquierda). B lee una respuesta (derecha). Elige una palabra de cada columna.</w:t>
+        <w:t>Español: Con un compañero: lee de izquierda a derecha. A lee una pregunta (izquierda). B lee una respuesta (derecha). Elige una palabra de cada columna.</w:t>
       </w:r>
     </w:p>
     <w:p>
@@ -16431,7 +14930,7 @@
           <w:color w:val="1B6F7A"/>
           <w:sz w:val="34"/>
         </w:rPr>
-        <w:t>✏️ Practice: Write the missing word.</w:t>
+        <w:t>Practice: Write the missing word.</w:t>
       </w:r>
     </w:p>
     <w:p>
@@ -17485,7 +15984,7 @@
           <w:color w:val="1B6F7A"/>
           <w:sz w:val="34"/>
         </w:rPr>
-        <w:t>🚶 🗣️ ✏️ Walk and talk. Ask 5 or 6 classmates. Write their names.</w:t>
+        <w:t>Walk and talk. Ask 5 or 6 classmates. Write their names.</w:t>
       </w:r>
     </w:p>
     <w:p>
@@ -17708,7 +16207,7 @@
                 <w:i w:val="0"/>
                 <w:sz w:val="25"/>
               </w:rPr>
-              <w:t xml:space="preserve"> 🔁 </w:t>
+              <w:t xml:space="preserve"> </w:t>
             </w:r>
             <w:r>
               <w:rPr>
@@ -17724,7 +16223,7 @@
                 <w:i w:val="0"/>
                 <w:sz w:val="25"/>
               </w:rPr>
-              <w:t xml:space="preserve">   🤷 </w:t>
+              <w:t xml:space="preserve">   </w:t>
             </w:r>
             <w:r>
               <w:rPr>
@@ -17760,7 +16259,7 @@
           <w:color w:val="1B6F7A"/>
           <w:sz w:val="34"/>
         </w:rPr>
-        <w:t>✅ Your partner looks. Is it right? Your partner checks ✓.</w:t>
+        <w:t>Your partner looks. Is it right? Your partner checks ✓.</w:t>
       </w:r>
     </w:p>
     <w:p>
@@ -18337,7 +16836,7 @@
           <w:color w:val="1B6F7A"/>
           <w:sz w:val="34"/>
         </w:rPr>
-        <w:t>🏠 Homework (10 minutes). Bring it next week!</w:t>
+        <w:t>Homework (10 minutes). Bring it next week!</w:t>
       </w:r>
     </w:p>
     <w:p>
@@ -18378,7 +16877,7 @@
           <w:color w:val="1B6F7A"/>
           <w:sz w:val="34"/>
         </w:rPr>
-        <w:t>1. ✏️ Write your name.</w:t>
+        <w:t>1. Write your name.</w:t>
       </w:r>
     </w:p>
     <w:p>
@@ -18458,7 +16957,7 @@
           <w:color w:val="1B6F7A"/>
           <w:sz w:val="34"/>
         </w:rPr>
-        <w:t>2. 🗣️ 👨‍👩‍👧 Ask a friend or a family member. Write the name.</w:t>
+        <w:t>2. Ask a friend or a family member. Write the name.</w:t>
       </w:r>
     </w:p>
     <w:p>
@@ -18588,7 +17087,7 @@
           <w:color w:val="1B6F7A"/>
           <w:sz w:val="34"/>
         </w:rPr>
-        <w:t>3. 📖 ✏️ Look. Write the word.</w:t>
+        <w:t>3. Look. Write the word.</w:t>
       </w:r>
     </w:p>
     <w:p>
@@ -18933,7 +17432,7 @@
           <w:color w:val="1B6F7A"/>
           <w:sz w:val="34"/>
         </w:rPr>
-        <w:t>4. 🗣️ Say the alphabet A to Z. Say it 2 times.</w:t>
+        <w:t>4. Say the alphabet A to Z. Say it 2 times.</w:t>
       </w:r>
     </w:p>
     <w:p>
@@ -18993,7 +17492,7 @@
           <w:color w:val="1B6F7A"/>
           <w:sz w:val="34"/>
         </w:rPr>
-        <w:t>A. 👂 🗣️ Look. Listen. Say the alphabet.</w:t>
+        <w:t>A. Look. Listen. Say the alphabet.</w:t>
       </w:r>
     </w:p>
     <w:p>
@@ -19872,7 +18371,7 @@
           <w:color w:val="1B6F7A"/>
           <w:sz w:val="34"/>
         </w:rPr>
-        <w:t>⚠️ 🗣️ Tricky letters: say them slowly.</w:t>
+        <w:t>Tricky letters: say them slowly.</w:t>
       </w:r>
     </w:p>
     <w:p>
@@ -20770,7 +19269,7 @@
           <w:color w:val="1B6F7A"/>
           <w:sz w:val="34"/>
         </w:rPr>
-        <w:t>B. 👂 ⭕ Listen to the teacher. Circle the letter.</w:t>
+        <w:t>B. Listen to the teacher. Circle the letter.</w:t>
       </w:r>
     </w:p>
     <w:p>
@@ -21442,7 +19941,7 @@
           <w:color w:val="1B6F7A"/>
           <w:sz w:val="34"/>
         </w:rPr>
-        <w:t>C. ✏️ Write your name in CAPITAL letters and small letters.</w:t>
+        <w:t>C. Write your name in CAPITAL letters and small letters.</w:t>
       </w:r>
     </w:p>
     <w:p>
@@ -21509,7 +20008,7 @@
           <w:color w:val="1B6F7A"/>
           <w:sz w:val="34"/>
         </w:rPr>
-        <w:t>D. 👥 🗣️ ✏️ Spell your name. Your partner writes it.</w:t>
+        <w:t>D. Spell your name. Your partner writes it.</w:t>
       </w:r>
     </w:p>
     <w:p>
@@ -21595,7 +20094,7 @@
           <w:color w:val="1B6F7A"/>
           <w:sz w:val="34"/>
         </w:rPr>
-        <w:t>A. 👂 ⭕ Listen to the teacher. Circle the letter.</w:t>
+        <w:t>A. Listen to the teacher. Circle the letter.</w:t>
       </w:r>
     </w:p>
     <w:p>
@@ -22267,7 +20766,7 @@
           <w:color w:val="1B6F7A"/>
           <w:sz w:val="34"/>
         </w:rPr>
-        <w:t>B. 📖 🔗 Match the question and the answer. Draw a line.</w:t>
+        <w:t>B. Match the question and the answer. Draw a line.</w:t>
       </w:r>
     </w:p>
     <w:p>
@@ -22360,7 +20859,7 @@
                 <w:color w:val="FFFFFF"/>
                 <w:sz w:val="24"/>
               </w:rPr>
-              <w:t>✏️ Draw a line.</w:t>
+              <w:t>Draw a line.</w:t>
             </w:r>
           </w:p>
         </w:tc>
@@ -22642,7 +21141,7 @@
           <w:color w:val="1B6F7A"/>
           <w:sz w:val="34"/>
         </w:rPr>
-        <w:t>C. ✏️ Write.</w:t>
+        <w:t>C. Write.</w:t>
       </w:r>
     </w:p>
     <w:p>
@@ -22709,7 +21208,7 @@
           <w:color w:val="1B6F7A"/>
           <w:sz w:val="34"/>
         </w:rPr>
-        <w:t>D. ✅ How do you feel? Check ✓ one face for each line.</w:t>
+        <w:t>D. How do you feel? Check ✓ one face for each line.</w:t>
       </w:r>
     </w:p>
     <w:p>
@@ -23304,7 +21803,7 @@
           <w:i w:val="0"/>
           <w:sz w:val="22"/>
         </w:rPr>
-        <w:t>Task icons on the pages are standard emoji characters shown with the computer's emoji font. Listening audio: synthetic voices made with Chatterbox TTS (Resemble AI, MIT License); each file carries an inaudible Perth watermark marking it as AI-generated. Ana's voice is based on LibriTTS-R speaker 1580 (Koizumi et al. 2023, CC BY 4.0, https://creativecommons.org/licenses/by/4.0/), from LibriVox public-domain readings. Course materials: © 2026 the authors, CC BY-NC-SA 4.0.</w:t>
+        <w:t>Other small pictures on the pages (for example, the faces on the Progress Check) are standard emoji characters shown with the computer's emoji font. Listening audio: synthetic voices made with Chatterbox TTS (Resemble AI, MIT License); each file carries an inaudible Perth watermark marking it as AI-generated. Ana's voice is based on LibriTTS-R speaker 1580 (Koizumi et al. 2023, CC BY 4.0, https://creativecommons.org/licenses/by/4.0/), from LibriVox public-domain readings. Course materials: © 2026 the authors, CC BY-NC-SA 4.0.</w:t>
       </w:r>
     </w:p>
     <w:sectPr>

</xml_diff>

<commit_message>
Level 1 Lesson 1: new synthetic Ana voice (Kokoro af_jessica reference)
- Rebuild L1_listening.mp3 with Ana cloned from a Kokoro-82M clip (af_jessica);
  narrator, receptionist and Carlos unchanged (Kokoro-made N, Receptionist, Sam refs).
  Same settings (EXAG 0.72, CFG 0.32, whole-sentence takes, 1.3 s pauses); 76 s.
  Every line passes Whisper; no clipping.
- Add the reference clip (kokoro_refs/af_jessica.wav) and make_ana_ref.py;
  remove fetch_ana_ref.py and every credit to the former human reference.
- Update the About page, lesson text (+ PDF/DOCX), slide 23 (+ presenter data),
  audio README and MAINTAINING.md section 8; listening length now about 1:16.
</commit_message>
<xml_diff>
--- a/public/level1/downloads/Level1_Lesson1.docx
+++ b/public/level1/downloads/Level1_Lesson1.docx
@@ -7240,7 +7240,7 @@
           <w:color w:val="1B6F7A"/>
           <w:sz w:val="30"/>
         </w:rPr>
-        <w:t xml:space="preserve"> (about 1:14; the conversation plays once, so play the audio again if needed)</w:t>
+        <w:t xml:space="preserve"> (about 1:16; the conversation plays once, so play the audio again if needed)</w:t>
       </w:r>
     </w:p>
     <w:tbl>
@@ -21803,7 +21803,7 @@
           <w:i w:val="0"/>
           <w:sz w:val="22"/>
         </w:rPr>
-        <w:t>Other small pictures on the pages (for example, the faces on the Progress Check) are standard emoji characters shown with the computer's emoji font. Listening audio: synthetic voices made with Chatterbox TTS (Resemble AI, MIT License); each file carries an inaudible Perth watermark marking it as AI-generated. Ana's voice is based on LibriTTS-R speaker 1580 (Koizumi et al. 2023, CC BY 4.0, https://creativecommons.org/licenses/by/4.0/), from LibriVox public-domain readings. Course materials: © 2026 the authors, CC BY-NC-SA 4.0.</w:t>
+        <w:t>Other small pictures on the pages (for example, the faces on the Progress Check) are standard emoji characters shown with the computer's emoji font. Listening audio: synthetic voices made with Chatterbox TTS (Resemble AI, MIT License); each file carries an inaudible Perth watermark marking it as AI-generated. The voices are copied from short reference clips made with Kokoro-82M (Apache 2.0); no recordings of real people were used. Course materials: © 2026 the authors, CC BY-NC-SA 4.0.</w:t>
       </w:r>
     </w:p>
     <w:sectPr>

</xml_diff>

<commit_message>
Remove decorative emoji from Level 1 Lesson 1, its deck, the Level 3 plan and the site UI; refresh exported content (#50, #42, #51)
</commit_message>
<xml_diff>
--- a/public/level1/downloads/Level1_Lesson1.docx
+++ b/public/level1/downloads/Level1_Lesson1.docx
@@ -11783,7 +11783,7 @@
           <w:i/>
           <w:sz w:val="26"/>
         </w:rPr>
-        <w:t xml:space="preserve">Listen to 👩 </w:t>
+        <w:t xml:space="preserve">Listen to </w:t>
       </w:r>
       <w:r>
         <w:rPr>
@@ -11799,7 +11799,7 @@
           <w:i/>
           <w:sz w:val="26"/>
         </w:rPr>
-        <w:t xml:space="preserve"> and 👨 </w:t>
+        <w:t xml:space="preserve"> and </w:t>
       </w:r>
       <w:r>
         <w:rPr>
@@ -11874,9 +11874,9 @@
         </w:tblCellMar>
       </w:tblPr>
       <w:tblGrid>
-        <w:gridCol w:w="5058"/>
-        <w:gridCol w:w="2294"/>
-        <w:gridCol w:w="2294"/>
+        <w:gridCol w:w="4755"/>
+        <w:gridCol w:w="2446"/>
+        <w:gridCol w:w="2446"/>
       </w:tblGrid>
       <w:tr>
         <w:trPr>
@@ -11885,7 +11885,7 @@
         </w:trPr>
         <w:tc>
           <w:tcPr>
-            <w:tcW w:type="dxa" w:w="5058"/>
+            <w:tcW w:type="dxa" w:w="4756"/>
             <w:vAlign w:val="center"/>
             <w:shd w:val="clear" w:color="auto" w:fill="1F3A5F"/>
           </w:tcPr>
@@ -11898,7 +11898,7 @@
         </w:tc>
         <w:tc>
           <w:tcPr>
-            <w:tcW w:type="dxa" w:w="2295"/>
+            <w:tcW w:type="dxa" w:w="2446"/>
             <w:vAlign w:val="center"/>
             <w:shd w:val="clear" w:color="auto" w:fill="1F3A5F"/>
           </w:tcPr>
@@ -11914,13 +11914,13 @@
                 <w:color w:val="FFFFFF"/>
                 <w:sz w:val="24"/>
               </w:rPr>
-              <w:t>👩 Ana</w:t>
-            </w:r>
-          </w:p>
-        </w:tc>
-        <w:tc>
-          <w:tcPr>
-            <w:tcW w:type="dxa" w:w="2295"/>
+              <w:t>Ana</w:t>
+            </w:r>
+          </w:p>
+        </w:tc>
+        <w:tc>
+          <w:tcPr>
+            <w:tcW w:type="dxa" w:w="2446"/>
             <w:vAlign w:val="center"/>
             <w:shd w:val="clear" w:color="auto" w:fill="1F3A5F"/>
           </w:tcPr>
@@ -11936,7 +11936,7 @@
                 <w:color w:val="FFFFFF"/>
                 <w:sz w:val="24"/>
               </w:rPr>
-              <w:t>👨 Carlos</w:t>
+              <w:t>Carlos</w:t>
             </w:r>
           </w:p>
         </w:tc>
@@ -11947,7 +11947,7 @@
         </w:trPr>
         <w:tc>
           <w:tcPr>
-            <w:tcW w:type="dxa" w:w="5058"/>
+            <w:tcW w:type="dxa" w:w="4756"/>
             <w:vAlign w:val="center"/>
           </w:tcPr>
           <w:p>
@@ -11975,7 +11975,7 @@
         </w:tc>
         <w:tc>
           <w:tcPr>
-            <w:tcW w:type="dxa" w:w="2295"/>
+            <w:tcW w:type="dxa" w:w="2446"/>
             <w:vAlign w:val="center"/>
           </w:tcPr>
           <w:p>
@@ -11995,7 +11995,7 @@
         </w:tc>
         <w:tc>
           <w:tcPr>
-            <w:tcW w:type="dxa" w:w="2295"/>
+            <w:tcW w:type="dxa" w:w="2446"/>
             <w:vAlign w:val="center"/>
           </w:tcPr>
           <w:p>
@@ -12020,7 +12020,7 @@
         </w:trPr>
         <w:tc>
           <w:tcPr>
-            <w:tcW w:type="dxa" w:w="5058"/>
+            <w:tcW w:type="dxa" w:w="4756"/>
             <w:vAlign w:val="center"/>
             <w:shd w:val="clear" w:color="auto" w:fill="EEF4F7"/>
           </w:tcPr>
@@ -12049,7 +12049,7 @@
         </w:tc>
         <w:tc>
           <w:tcPr>
-            <w:tcW w:type="dxa" w:w="2295"/>
+            <w:tcW w:type="dxa" w:w="2446"/>
             <w:vAlign w:val="center"/>
             <w:shd w:val="clear" w:color="auto" w:fill="EEF4F7"/>
           </w:tcPr>
@@ -12070,7 +12070,7 @@
         </w:tc>
         <w:tc>
           <w:tcPr>
-            <w:tcW w:type="dxa" w:w="2295"/>
+            <w:tcW w:type="dxa" w:w="2446"/>
             <w:vAlign w:val="center"/>
             <w:shd w:val="clear" w:color="auto" w:fill="EEF4F7"/>
           </w:tcPr>
@@ -12096,7 +12096,7 @@
         </w:trPr>
         <w:tc>
           <w:tcPr>
-            <w:tcW w:type="dxa" w:w="5058"/>
+            <w:tcW w:type="dxa" w:w="4756"/>
             <w:vAlign w:val="center"/>
           </w:tcPr>
           <w:p>
@@ -12116,7 +12116,7 @@
         </w:tc>
         <w:tc>
           <w:tcPr>
-            <w:tcW w:type="dxa" w:w="2295"/>
+            <w:tcW w:type="dxa" w:w="2446"/>
             <w:vAlign w:val="center"/>
           </w:tcPr>
           <w:p>
@@ -12136,7 +12136,7 @@
         </w:tc>
         <w:tc>
           <w:tcPr>
-            <w:tcW w:type="dxa" w:w="2295"/>
+            <w:tcW w:type="dxa" w:w="2446"/>
             <w:vAlign w:val="center"/>
           </w:tcPr>
           <w:p>
@@ -12161,7 +12161,7 @@
         </w:trPr>
         <w:tc>
           <w:tcPr>
-            <w:tcW w:type="dxa" w:w="5058"/>
+            <w:tcW w:type="dxa" w:w="4756"/>
             <w:vAlign w:val="center"/>
             <w:shd w:val="clear" w:color="auto" w:fill="EEF4F7"/>
           </w:tcPr>
@@ -12175,13 +12175,13 @@
                 <w:i w:val="0"/>
                 <w:sz w:val="24"/>
               </w:rPr>
-              <w:t>4. Gets a book and a pen 📘 🖊️</w:t>
-            </w:r>
-          </w:p>
-        </w:tc>
-        <w:tc>
-          <w:tcPr>
-            <w:tcW w:type="dxa" w:w="2295"/>
+              <w:t>4. Gets a book and a pen</w:t>
+            </w:r>
+          </w:p>
+        </w:tc>
+        <w:tc>
+          <w:tcPr>
+            <w:tcW w:type="dxa" w:w="2446"/>
             <w:vAlign w:val="center"/>
             <w:shd w:val="clear" w:color="auto" w:fill="EEF4F7"/>
           </w:tcPr>
@@ -12201,7 +12201,7 @@
         </w:tc>
         <w:tc>
           <w:tcPr>
-            <w:tcW w:type="dxa" w:w="2295"/>
+            <w:tcW w:type="dxa" w:w="2446"/>
             <w:vAlign w:val="center"/>
             <w:shd w:val="clear" w:color="auto" w:fill="EEF4F7"/>
           </w:tcPr>
@@ -12291,7 +12291,7 @@
           <w:i w:val="0"/>
           <w:sz w:val="26"/>
         </w:rPr>
-        <w:t xml:space="preserve">👩 Ana:   </w:t>
+        <w:t xml:space="preserve">Ana:   </w:t>
       </w:r>
       <w:r>
         <w:rPr>
@@ -12329,7 +12329,7 @@
           <w:i w:val="0"/>
           <w:sz w:val="26"/>
         </w:rPr>
-        <w:t xml:space="preserve">👨 Carlos:   ( V / B )    ( E / I )    ( G / J )    </w:t>
+        <w:t xml:space="preserve">Carlos:   ( V / B )    ( E / I )    ( G / J )    </w:t>
       </w:r>
       <w:r>
         <w:rPr>
@@ -12400,7 +12400,7 @@
           <w:i w:val="0"/>
           <w:sz w:val="26"/>
         </w:rPr>
-        <w:t>👩 Ana  ___  ___  ___  ___</w:t>
+        <w:t>Ana  ___  ___  ___  ___</w:t>
       </w:r>
     </w:p>
     <w:p>
@@ -12422,7 +12422,7 @@
           <w:i w:val="0"/>
           <w:sz w:val="26"/>
         </w:rPr>
-        <w:t>👨 Carlos  ___  ___  ___  ___</w:t>
+        <w:t>Carlos  ___  ___  ___  ___</w:t>
       </w:r>
     </w:p>
     <w:p>
@@ -21260,10 +21260,10 @@
         </w:tblCellMar>
       </w:tblPr>
       <w:tblGrid>
-        <w:gridCol w:w="4771"/>
-        <w:gridCol w:w="1625"/>
-        <w:gridCol w:w="1625"/>
-        <w:gridCol w:w="1625"/>
+        <w:gridCol w:w="4623"/>
+        <w:gridCol w:w="1675"/>
+        <w:gridCol w:w="1675"/>
+        <w:gridCol w:w="1675"/>
       </w:tblGrid>
       <w:tr>
         <w:trPr>
@@ -21272,7 +21272,7 @@
         </w:trPr>
         <w:tc>
           <w:tcPr>
-            <w:tcW w:type="dxa" w:w="4772"/>
+            <w:tcW w:type="dxa" w:w="4623"/>
             <w:vAlign w:val="center"/>
             <w:shd w:val="clear" w:color="auto" w:fill="1F3A5F"/>
           </w:tcPr>
@@ -21294,7 +21294,7 @@
         </w:tc>
         <w:tc>
           <w:tcPr>
-            <w:tcW w:type="dxa" w:w="1625"/>
+            <w:tcW w:type="dxa" w:w="1675"/>
             <w:vAlign w:val="center"/>
             <w:shd w:val="clear" w:color="auto" w:fill="1F3A5F"/>
           </w:tcPr>
@@ -21316,7 +21316,7 @@
         </w:tc>
         <w:tc>
           <w:tcPr>
-            <w:tcW w:type="dxa" w:w="1625"/>
+            <w:tcW w:type="dxa" w:w="1675"/>
             <w:vAlign w:val="center"/>
             <w:shd w:val="clear" w:color="auto" w:fill="1F3A5F"/>
           </w:tcPr>
@@ -21338,7 +21338,7 @@
         </w:tc>
         <w:tc>
           <w:tcPr>
-            <w:tcW w:type="dxa" w:w="1625"/>
+            <w:tcW w:type="dxa" w:w="1675"/>
             <w:vAlign w:val="center"/>
             <w:shd w:val="clear" w:color="auto" w:fill="1F3A5F"/>
           </w:tcPr>
@@ -21365,7 +21365,7 @@
         </w:trPr>
         <w:tc>
           <w:tcPr>
-            <w:tcW w:type="dxa" w:w="4772"/>
+            <w:tcW w:type="dxa" w:w="4623"/>
             <w:vAlign w:val="center"/>
           </w:tcPr>
           <w:p>
@@ -21379,13 +21379,13 @@
                 <w:i w:val="0"/>
                 <w:sz w:val="24"/>
               </w:rPr>
-              <w:t>👋 I can say hello and goodbye.</w:t>
-            </w:r>
-          </w:p>
-        </w:tc>
-        <w:tc>
-          <w:tcPr>
-            <w:tcW w:type="dxa" w:w="1625"/>
+              <w:t>I can say hello and goodbye.</w:t>
+            </w:r>
+          </w:p>
+        </w:tc>
+        <w:tc>
+          <w:tcPr>
+            <w:tcW w:type="dxa" w:w="1675"/>
             <w:vAlign w:val="center"/>
           </w:tcPr>
           <w:p>
@@ -21405,7 +21405,7 @@
         </w:tc>
         <w:tc>
           <w:tcPr>
-            <w:tcW w:type="dxa" w:w="1625"/>
+            <w:tcW w:type="dxa" w:w="1675"/>
             <w:vAlign w:val="center"/>
           </w:tcPr>
           <w:p>
@@ -21425,7 +21425,7 @@
         </w:tc>
         <w:tc>
           <w:tcPr>
-            <w:tcW w:type="dxa" w:w="1625"/>
+            <w:tcW w:type="dxa" w:w="1675"/>
             <w:vAlign w:val="center"/>
           </w:tcPr>
           <w:p>
@@ -21450,7 +21450,7 @@
         </w:trPr>
         <w:tc>
           <w:tcPr>
-            <w:tcW w:type="dxa" w:w="4772"/>
+            <w:tcW w:type="dxa" w:w="4623"/>
             <w:vAlign w:val="center"/>
             <w:shd w:val="clear" w:color="auto" w:fill="EEF4F7"/>
           </w:tcPr>
@@ -21465,13 +21465,13 @@
                 <w:i w:val="0"/>
                 <w:sz w:val="24"/>
               </w:rPr>
-              <w:t>🪪 I can say my first and last name.</w:t>
-            </w:r>
-          </w:p>
-        </w:tc>
-        <w:tc>
-          <w:tcPr>
-            <w:tcW w:type="dxa" w:w="1625"/>
+              <w:t>I can say my first and last name.</w:t>
+            </w:r>
+          </w:p>
+        </w:tc>
+        <w:tc>
+          <w:tcPr>
+            <w:tcW w:type="dxa" w:w="1675"/>
             <w:vAlign w:val="center"/>
             <w:shd w:val="clear" w:color="auto" w:fill="EEF4F7"/>
           </w:tcPr>
@@ -21492,7 +21492,7 @@
         </w:tc>
         <w:tc>
           <w:tcPr>
-            <w:tcW w:type="dxa" w:w="1625"/>
+            <w:tcW w:type="dxa" w:w="1675"/>
             <w:vAlign w:val="center"/>
             <w:shd w:val="clear" w:color="auto" w:fill="EEF4F7"/>
           </w:tcPr>
@@ -21513,7 +21513,7 @@
         </w:tc>
         <w:tc>
           <w:tcPr>
-            <w:tcW w:type="dxa" w:w="1625"/>
+            <w:tcW w:type="dxa" w:w="1675"/>
             <w:vAlign w:val="center"/>
             <w:shd w:val="clear" w:color="auto" w:fill="EEF4F7"/>
           </w:tcPr>
@@ -21539,7 +21539,7 @@
         </w:trPr>
         <w:tc>
           <w:tcPr>
-            <w:tcW w:type="dxa" w:w="4772"/>
+            <w:tcW w:type="dxa" w:w="4623"/>
             <w:vAlign w:val="center"/>
           </w:tcPr>
           <w:p>
@@ -21553,13 +21553,13 @@
                 <w:i w:val="0"/>
                 <w:sz w:val="24"/>
               </w:rPr>
-              <w:t>🔤 I can spell my name.</w:t>
-            </w:r>
-          </w:p>
-        </w:tc>
-        <w:tc>
-          <w:tcPr>
-            <w:tcW w:type="dxa" w:w="1625"/>
+              <w:t>I can spell my name.</w:t>
+            </w:r>
+          </w:p>
+        </w:tc>
+        <w:tc>
+          <w:tcPr>
+            <w:tcW w:type="dxa" w:w="1675"/>
             <w:vAlign w:val="center"/>
           </w:tcPr>
           <w:p>
@@ -21579,7 +21579,7 @@
         </w:tc>
         <w:tc>
           <w:tcPr>
-            <w:tcW w:type="dxa" w:w="1625"/>
+            <w:tcW w:type="dxa" w:w="1675"/>
             <w:vAlign w:val="center"/>
           </w:tcPr>
           <w:p>
@@ -21599,7 +21599,7 @@
         </w:tc>
         <w:tc>
           <w:tcPr>
-            <w:tcW w:type="dxa" w:w="1625"/>
+            <w:tcW w:type="dxa" w:w="1675"/>
             <w:vAlign w:val="center"/>
           </w:tcPr>
           <w:p>
@@ -21624,7 +21624,7 @@
         </w:trPr>
         <w:tc>
           <w:tcPr>
-            <w:tcW w:type="dxa" w:w="4772"/>
+            <w:tcW w:type="dxa" w:w="4623"/>
             <w:vAlign w:val="center"/>
             <w:shd w:val="clear" w:color="auto" w:fill="EEF4F7"/>
           </w:tcPr>
@@ -21638,7 +21638,7 @@
                 <w:i w:val="0"/>
                 <w:sz w:val="24"/>
               </w:rPr>
-              <w:t xml:space="preserve">🔁 I can ask </w:t>
+              <w:t xml:space="preserve">I can ask </w:t>
             </w:r>
             <w:r>
               <w:rPr>
@@ -21652,7 +21652,7 @@
         </w:tc>
         <w:tc>
           <w:tcPr>
-            <w:tcW w:type="dxa" w:w="1625"/>
+            <w:tcW w:type="dxa" w:w="1675"/>
             <w:vAlign w:val="center"/>
             <w:shd w:val="clear" w:color="auto" w:fill="EEF4F7"/>
           </w:tcPr>
@@ -21672,7 +21672,7 @@
         </w:tc>
         <w:tc>
           <w:tcPr>
-            <w:tcW w:type="dxa" w:w="1625"/>
+            <w:tcW w:type="dxa" w:w="1675"/>
             <w:vAlign w:val="center"/>
             <w:shd w:val="clear" w:color="auto" w:fill="EEF4F7"/>
           </w:tcPr>
@@ -21692,7 +21692,7 @@
         </w:tc>
         <w:tc>
           <w:tcPr>
-            <w:tcW w:type="dxa" w:w="1625"/>
+            <w:tcW w:type="dxa" w:w="1675"/>
             <w:vAlign w:val="center"/>
             <w:shd w:val="clear" w:color="auto" w:fill="EEF4F7"/>
           </w:tcPr>

</xml_diff>